<commit_message>
Review deck: 10 slides (architecture + tech stack, methodology, risk register, larger impact text, literature review, conclusions, thank you); report on department letterhead; IEEE figures placed beside their text; lab gate now refuses dynamic import(); label fitting uses the SVG's own width; spent Gemini keys skipped in diagram requests; LNCS experiment script
</commit_message>
<xml_diff>
--- a/docs/report/Learnova_Project_Report.docx
+++ b/docs/report/Learnova_Project_Report.docx
@@ -13901,9 +13901,12 @@
     </w:tbl>
     <w:bookmarkEnd w:id="135"/>
     <w:sectPr>
+      <w:headerReference w:type="default" r:id="rId9"/>
+      <w:footerReference w:type="default" r:id="rId10"/>
       <w:footnotePr>
         <w:numRestart w:val="eachSect"/>
       </w:footnotePr>
+      <w:pgMar w:header="504" w:top="2376"/>
     </w:sectPr>
   </w:body>
 </w:document>
@@ -13913,6 +13916,26 @@
 <w:comments xmlns:w="http://schemas.openxmlformats.org/wordprocessingml/2006/main" xmlns:m="http://schemas.openxmlformats.org/officeDocument/2006/math" xmlns:r="http://schemas.openxmlformats.org/officeDocument/2006/relationships" xmlns:o="urn:schemas-microsoft-com:office:office" xmlns:v="urn:schemas-microsoft-com:vml" xmlns:w10="urn:schemas-microsoft-com:office:word" xmlns:a="http://schemas.openxmlformats.org/drawingml/2006/main" xmlns:pic="http://schemas.openxmlformats.org/drawingml/2006/picture" xmlns:wp="http://schemas.openxmlformats.org/drawingml/2006/wordprocessingDrawing"/>
 </file>
 
+<file path=word/footer1.xml><?xml version="1.0" encoding="utf-8"?>
+<w:ftr xmlns:m="http://schemas.openxmlformats.org/officeDocument/2006/math" xmlns:mc="http://schemas.openxmlformats.org/markup-compatibility/2006" xmlns:mo="http://schemas.microsoft.com/office/mac/office/2008/main" xmlns:mv="urn:schemas-microsoft-com:mac:vml" xmlns:o="urn:schemas-microsoft-com:office:office" xmlns:r="http://schemas.openxmlformats.org/officeDocument/2006/relationships" xmlns:v="urn:schemas-microsoft-com:vml" xmlns:w10="urn:schemas-microsoft-com:office:word" xmlns:w14="http://schemas.microsoft.com/office/word/2010/wordml" xmlns:w="http://schemas.openxmlformats.org/wordprocessingml/2006/main" xmlns:wne="http://schemas.microsoft.com/office/word/2006/wordml" xmlns:wp14="http://schemas.microsoft.com/office/word/2010/wordprocessingDrawing" xmlns:wp="http://schemas.openxmlformats.org/drawingml/2006/wordprocessingDrawing" xmlns:wpc="http://schemas.microsoft.com/office/word/2010/wordprocessingCanvas" xmlns:wpg="http://schemas.microsoft.com/office/word/2010/wordprocessingGroup" xmlns:wpi="http://schemas.microsoft.com/office/word/2010/wordprocessingInk" xmlns:wps="http://schemas.microsoft.com/office/word/2010/wordprocessingShape" mc:Ignorable="w14 wp14">
+  <w:p>
+    <w:pPr>
+      <w:pStyle w:val="Footer"/>
+      <w:jc w:val="right"/>
+    </w:pPr>
+    <w:r>
+      <w:rPr>
+        <w:rFonts w:ascii="Times New Roman" w:hAnsi="Times New Roman"/>
+        <w:sz w:val="22"/>
+      </w:rPr>
+      <w:fldChar w:fldCharType="begin"/>
+      <w:instrText xml:space="preserve">PAGE</w:instrText>
+      <w:fldChar w:fldCharType="end"/>
+    </w:r>
+  </w:p>
+</w:ftr>
+</file>
+
 <file path=word/footnotes.xml><?xml version="1.0" encoding="utf-8"?>
 <w:footnotes xmlns:w="http://schemas.openxmlformats.org/wordprocessingml/2006/main" xmlns:m="http://schemas.openxmlformats.org/officeDocument/2006/math" xmlns:r="http://schemas.openxmlformats.org/officeDocument/2006/relationships" xmlns:o="urn:schemas-microsoft-com:office:office" xmlns:v="urn:schemas-microsoft-com:vml" xmlns:w10="urn:schemas-microsoft-com:office:word" xmlns:a="http://schemas.openxmlformats.org/drawingml/2006/main" xmlns:pic="http://schemas.openxmlformats.org/drawingml/2006/picture" xmlns:wp="http://schemas.openxmlformats.org/drawingml/2006/wordprocessingDrawing">
   <w:footnote w:type="continuationSeparator" w:id="0">
@@ -13930,6 +13953,65 @@
     </w:p>
   </w:footnote>
 </w:footnotes>
+</file>
+
+<file path=word/header1.xml><?xml version="1.0" encoding="utf-8"?>
+<w:hdr xmlns:m="http://schemas.openxmlformats.org/officeDocument/2006/math" xmlns:mc="http://schemas.openxmlformats.org/markup-compatibility/2006" xmlns:mo="http://schemas.microsoft.com/office/mac/office/2008/main" xmlns:mv="urn:schemas-microsoft-com:mac:vml" xmlns:o="urn:schemas-microsoft-com:office:office" xmlns:r="http://schemas.openxmlformats.org/officeDocument/2006/relationships" xmlns:v="urn:schemas-microsoft-com:vml" xmlns:w10="urn:schemas-microsoft-com:office:word" xmlns:w14="http://schemas.microsoft.com/office/word/2010/wordml" xmlns:w="http://schemas.openxmlformats.org/wordprocessingml/2006/main" xmlns:wne="http://schemas.microsoft.com/office/word/2006/wordml" xmlns:wp14="http://schemas.microsoft.com/office/word/2010/wordprocessingDrawing" xmlns:wp="http://schemas.openxmlformats.org/drawingml/2006/wordprocessingDrawing" xmlns:wpc="http://schemas.microsoft.com/office/word/2010/wordprocessingCanvas" xmlns:wpg="http://schemas.microsoft.com/office/word/2010/wordprocessingGroup" xmlns:wpi="http://schemas.microsoft.com/office/word/2010/wordprocessingInk" xmlns:wps="http://schemas.microsoft.com/office/word/2010/wordprocessingShape" mc:Ignorable="w14 wp14">
+  <w:p>
+    <w:pPr>
+      <w:spacing w:after="0"/>
+      <w:jc w:val="center"/>
+    </w:pPr>
+    <w:r>
+      <w:drawing>
+        <wp:inline xmlns:a="http://schemas.openxmlformats.org/drawingml/2006/main" xmlns:pic="http://schemas.openxmlformats.org/drawingml/2006/picture">
+          <wp:extent cx="5733288" cy="869426"/>
+          <wp:docPr id="1" name="Picture 1"/>
+          <wp:cNvGraphicFramePr>
+            <a:graphicFrameLocks noChangeAspect="1"/>
+          </wp:cNvGraphicFramePr>
+          <a:graphic>
+            <a:graphicData uri="http://schemas.openxmlformats.org/drawingml/2006/picture">
+              <pic:pic>
+                <pic:nvPicPr>
+                  <pic:cNvPr id="0" name="letterhead.jpeg"/>
+                  <pic:cNvPicPr/>
+                </pic:nvPicPr>
+                <pic:blipFill>
+                  <a:blip r:embed="rId1"/>
+                  <a:stretch>
+                    <a:fillRect/>
+                  </a:stretch>
+                </pic:blipFill>
+                <pic:spPr>
+                  <a:xfrm>
+                    <a:off x="0" y="0"/>
+                    <a:ext cx="5733288" cy="869426"/>
+                  </a:xfrm>
+                  <a:prstGeom prst="rect"/>
+                </pic:spPr>
+              </pic:pic>
+            </a:graphicData>
+          </a:graphic>
+        </wp:inline>
+      </w:drawing>
+    </w:r>
+  </w:p>
+  <w:p>
+    <w:pPr>
+      <w:spacing w:after="120"/>
+      <w:jc w:val="center"/>
+    </w:pPr>
+    <w:r>
+      <w:rPr>
+        <w:rFonts w:ascii="Times New Roman" w:hAnsi="Times New Roman"/>
+        <w:b/>
+        <w:sz w:val="24"/>
+      </w:rPr>
+      <w:t>Department of Artificial Intelligence (AI) and Data Science</w:t>
+    </w:r>
+  </w:p>
+</w:hdr>
 </file>
 
 <file path=word/numbering.xml><?xml version="1.0" encoding="utf-8"?>

</xml_diff>

<commit_message>
Report: denser layout (1.15 spacing, floating figures, slimmer letterhead), section on fixes from the review-deck round, updated test and benchmark numbers
</commit_message>
<xml_diff>
--- a/docs/report/Learnova_Project_Report.docx
+++ b/docs/report/Learnova_Project_Report.docx
@@ -1934,8 +1934,8 @@
         <w:tblCaption w:val="Functional requirements."/>
       </w:tblPr>
       <w:tblGrid>
-        <w:gridCol w:w="3960"/>
-        <w:gridCol w:w="3960"/>
+        <w:gridCol w:w="950"/>
+        <w:gridCol w:w="6969"/>
       </w:tblGrid>
       <w:tr>
         <w:trPr>
@@ -2337,8 +2337,8 @@
         <w:tblCaption w:val="Non-functional requirements."/>
       </w:tblPr>
       <w:tblGrid>
-        <w:gridCol w:w="3960"/>
-        <w:gridCol w:w="3960"/>
+        <w:gridCol w:w="950"/>
+        <w:gridCol w:w="6969"/>
       </w:tblGrid>
       <w:tr>
         <w:trPr>
@@ -2597,7 +2597,7 @@
         <w:t xml:space="preserve"> </w:t>
       </w:r>
       <w:r>
-        <w:t xml:space="preserve">Every component of the system relies on mature open-source libraries, and the complete pipeline runs on an ordinary laptop. The prototype is working end to end, with 755 automated tests.</w:t>
+        <w:t xml:space="preserve">Every component of the system relies on mature open-source libraries, and the complete pipeline runs on an ordinary laptop. The prototype is working end to end, with 757 automated tests.</w:t>
       </w:r>
     </w:p>
     <w:p>
@@ -2707,7 +2707,7 @@
       <w:r>
         <w:drawing>
           <wp:inline>
-            <wp:extent cx="5334000" cy="3850192"/>
+            <wp:extent cx="3840480" cy="2772138"/>
             <wp:effectExtent b="0" l="0" r="0" t="0"/>
             <wp:docPr descr="System architecture: inputs, ingestion, engines, AI service and outputs, with deployment and methodology." title="" id="34" name="Picture"/>
             <a:graphic>
@@ -2728,7 +2728,7 @@
                   <pic:spPr bwMode="auto">
                     <a:xfrm>
                       <a:off x="0" y="0"/>
-                      <a:ext cx="5334000" cy="3850192"/>
+                      <a:ext cx="3840480" cy="2772138"/>
                     </a:xfrm>
                     <a:prstGeom prst="rect">
                       <a:avLst/>
@@ -3739,22 +3739,7 @@
               <w:pStyle w:val="Compact"/>
             </w:pPr>
             <w:r>
-              <w:rPr>
-                <w:rStyle w:val="VerbatimChar"/>
-              </w:rPr>
-              <w:t xml:space="preserve">POST /api/auth/otp/request</w:t>
-            </w:r>
-            <w:r>
-              <w:t xml:space="preserve">,</w:t>
-            </w:r>
-            <w:r>
-              <w:t xml:space="preserve"> </w:t>
-            </w:r>
-            <w:r>
-              <w:rPr>
-                <w:rStyle w:val="VerbatimChar"/>
-              </w:rPr>
-              <w:t xml:space="preserve">POST /api/auth/otp/verify</w:t>
+              <w:t xml:space="preserve">POST /api/auth/otp/request, POST /api/auth/otp/verify</w:t>
             </w:r>
           </w:p>
         </w:tc>
@@ -3778,46 +3763,7 @@
               <w:pStyle w:val="Compact"/>
             </w:pPr>
             <w:r>
-              <w:rPr>
-                <w:rStyle w:val="VerbatimChar"/>
-              </w:rPr>
-              <w:t xml:space="preserve">POST /api/jobs</w:t>
-            </w:r>
-            <w:r>
-              <w:t xml:space="preserve">,</w:t>
-            </w:r>
-            <w:r>
-              <w:t xml:space="preserve"> </w:t>
-            </w:r>
-            <w:r>
-              <w:rPr>
-                <w:rStyle w:val="VerbatimChar"/>
-              </w:rPr>
-              <w:t xml:space="preserve">POST /api/jobs/{id}/generate</w:t>
-            </w:r>
-            <w:r>
-              <w:t xml:space="preserve">,</w:t>
-            </w:r>
-            <w:r>
-              <w:t xml:space="preserve"> </w:t>
-            </w:r>
-            <w:r>
-              <w:rPr>
-                <w:rStyle w:val="VerbatimChar"/>
-              </w:rPr>
-              <w:t xml:space="preserve">GET /api/jobs/{id}</w:t>
-            </w:r>
-            <w:r>
-              <w:t xml:space="preserve">,</w:t>
-            </w:r>
-            <w:r>
-              <w:t xml:space="preserve"> </w:t>
-            </w:r>
-            <w:r>
-              <w:rPr>
-                <w:rStyle w:val="VerbatimChar"/>
-              </w:rPr>
-              <w:t xml:space="preserve">GET /api/jobs/{id}/download/{artifact}</w:t>
+              <w:t xml:space="preserve">POST /api/jobs, POST /api/jobs/{id}/generate, GET /api/jobs/{id}, GET /api/jobs/{id}/download/{artifact}</w:t>
             </w:r>
           </w:p>
         </w:tc>
@@ -3841,46 +3787,7 @@
               <w:pStyle w:val="Compact"/>
             </w:pPr>
             <w:r>
-              <w:rPr>
-                <w:rStyle w:val="VerbatimChar"/>
-              </w:rPr>
-              <w:t xml:space="preserve">GET /api/decks</w:t>
-            </w:r>
-            <w:r>
-              <w:t xml:space="preserve">,</w:t>
-            </w:r>
-            <w:r>
-              <w:t xml:space="preserve"> </w:t>
-            </w:r>
-            <w:r>
-              <w:rPr>
-                <w:rStyle w:val="VerbatimChar"/>
-              </w:rPr>
-              <w:t xml:space="preserve">GET /api/decks/{id}/editable</w:t>
-            </w:r>
-            <w:r>
-              <w:t xml:space="preserve">,</w:t>
-            </w:r>
-            <w:r>
-              <w:t xml:space="preserve"> </w:t>
-            </w:r>
-            <w:r>
-              <w:rPr>
-                <w:rStyle w:val="VerbatimChar"/>
-              </w:rPr>
-              <w:t xml:space="preserve">PUT /api/decks/{id}/slides</w:t>
-            </w:r>
-            <w:r>
-              <w:t xml:space="preserve">,</w:t>
-            </w:r>
-            <w:r>
-              <w:t xml:space="preserve"> </w:t>
-            </w:r>
-            <w:r>
-              <w:rPr>
-                <w:rStyle w:val="VerbatimChar"/>
-              </w:rPr>
-              <w:t xml:space="preserve">POST /api/decks/{id}/refresh</w:t>
+              <w:t xml:space="preserve">GET /api/decks, GET /api/decks/{id}/editable, PUT /api/decks/{id}/slides, POST /api/decks/{id}/refresh</w:t>
             </w:r>
           </w:p>
         </w:tc>
@@ -3904,22 +3811,7 @@
               <w:pStyle w:val="Compact"/>
             </w:pPr>
             <w:r>
-              <w:rPr>
-                <w:rStyle w:val="VerbatimChar"/>
-              </w:rPr>
-              <w:t xml:space="preserve">POST /api/decks/{id}/shares</w:t>
-            </w:r>
-            <w:r>
-              <w:t xml:space="preserve">,</w:t>
-            </w:r>
-            <w:r>
-              <w:t xml:space="preserve"> </w:t>
-            </w:r>
-            <w:r>
-              <w:rPr>
-                <w:rStyle w:val="VerbatimChar"/>
-              </w:rPr>
-              <w:t xml:space="preserve">GET /api/share/{token}</w:t>
+              <w:t xml:space="preserve">POST /api/decks/{id}/shares, GET /api/share/{token}</w:t>
             </w:r>
           </w:p>
         </w:tc>
@@ -3943,58 +3835,7 @@
               <w:pStyle w:val="Compact"/>
             </w:pPr>
             <w:r>
-              <w:rPr>
-                <w:rStyle w:val="VerbatimChar"/>
-              </w:rPr>
-              <w:t xml:space="preserve">POST /api/explain</w:t>
-            </w:r>
-            <w:r>
-              <w:t xml:space="preserve">,</w:t>
-            </w:r>
-            <w:r>
-              <w:t xml:space="preserve"> </w:t>
-            </w:r>
-            <w:r>
-              <w:rPr>
-                <w:rStyle w:val="VerbatimChar"/>
-              </w:rPr>
-              <w:t xml:space="preserve">GET /api/labs</w:t>
-            </w:r>
-            <w:r>
-              <w:t xml:space="preserve">,</w:t>
-            </w:r>
-            <w:r>
-              <w:t xml:space="preserve"> </w:t>
-            </w:r>
-            <w:r>
-              <w:rPr>
-                <w:rStyle w:val="VerbatimChar"/>
-              </w:rPr>
-              <w:t xml:space="preserve">GET /api/labs/{id}</w:t>
-            </w:r>
-            <w:r>
-              <w:t xml:space="preserve">,</w:t>
-            </w:r>
-            <w:r>
-              <w:t xml:space="preserve"> </w:t>
-            </w:r>
-            <w:r>
-              <w:rPr>
-                <w:rStyle w:val="VerbatimChar"/>
-              </w:rPr>
-              <w:t xml:space="preserve">GET /api/art/{id}</w:t>
-            </w:r>
-            <w:r>
-              <w:t xml:space="preserve">,</w:t>
-            </w:r>
-            <w:r>
-              <w:t xml:space="preserve"> </w:t>
-            </w:r>
-            <w:r>
-              <w:rPr>
-                <w:rStyle w:val="VerbatimChar"/>
-              </w:rPr>
-              <w:t xml:space="preserve">POST /api/decks/{id}/chat</w:t>
+              <w:t xml:space="preserve">POST /api/explain, GET /api/labs, GET /api/labs/{id}, GET /api/art/{id}, POST /api/decks/{id}/chat</w:t>
             </w:r>
           </w:p>
         </w:tc>
@@ -4212,7 +4053,7 @@
       <w:r>
         <w:drawing>
           <wp:inline>
-            <wp:extent cx="4800600" cy="3600450"/>
+            <wp:extent cx="3467100" cy="2600325"/>
             <wp:effectExtent b="0" l="0" r="0" t="0"/>
             <wp:docPr descr="Deck preview page showing each slide, the visual chosen and the reason." title="" id="48" name="Picture"/>
             <a:graphic>
@@ -4233,7 +4074,7 @@
                   <pic:spPr bwMode="auto">
                     <a:xfrm>
                       <a:off x="0" y="0"/>
-                      <a:ext cx="4800600" cy="3600450"/>
+                      <a:ext cx="3467100" cy="2600325"/>
                     </a:xfrm>
                     <a:prstGeom prst="rect">
                       <a:avLst/>
@@ -8715,7 +8556,7 @@
       <w:r>
         <w:drawing>
           <wp:inline>
-            <wp:extent cx="5067300" cy="1501422"/>
+            <wp:extent cx="3627120" cy="1074702"/>
             <wp:effectExtent b="0" l="0" r="0" t="0"/>
             <wp:docPr descr="Diagrams written by the language model for four slides." title="" id="58" name="Picture"/>
             <a:graphic>
@@ -8736,7 +8577,7 @@
                   <pic:spPr bwMode="auto">
                     <a:xfrm>
                       <a:off x="0" y="0"/>
-                      <a:ext cx="5067300" cy="1501422"/>
+                      <a:ext cx="3627120" cy="1074702"/>
                     </a:xfrm>
                     <a:prstGeom prst="rect">
                       <a:avLst/>
@@ -9074,7 +8915,7 @@
     </w:p>
     <w:bookmarkEnd w:id="64"/>
     <w:bookmarkEnd w:id="65"/>
-    <w:bookmarkStart w:id="80" w:name="implementation"/>
+    <w:bookmarkStart w:id="81" w:name="implementation"/>
     <w:p>
       <w:pPr>
         <w:pStyle w:val="Heading1"/>
@@ -9479,7 +9320,7 @@
               <w:pStyle w:val="Compact"/>
             </w:pPr>
             <w:r>
-              <w:t xml:space="preserve">755 automated tests</w:t>
+              <w:t xml:space="preserve">757 automated tests</w:t>
             </w:r>
           </w:p>
         </w:tc>
@@ -9907,7 +9748,7 @@
       <w:r>
         <w:drawing>
           <wp:inline>
-            <wp:extent cx="4533900" cy="3400425"/>
+            <wp:extent cx="3253740" cy="2440304"/>
             <wp:effectExtent b="0" l="0" r="0" t="0"/>
             <wp:docPr descr="Solve page: a problem explained step by step." title="" id="70" name="Picture"/>
             <a:graphic>
@@ -9928,7 +9769,7 @@
                   <pic:spPr bwMode="auto">
                     <a:xfrm>
                       <a:off x="0" y="0"/>
-                      <a:ext cx="4533900" cy="3400425"/>
+                      <a:ext cx="3253740" cy="2440304"/>
                     </a:xfrm>
                     <a:prstGeom prst="rect">
                       <a:avLst/>
@@ -9962,7 +9803,7 @@
       <w:r>
         <w:drawing>
           <wp:inline>
-            <wp:extent cx="4533900" cy="3379816"/>
+            <wp:extent cx="3253740" cy="2425515"/>
             <wp:effectExtent b="0" l="0" r="0" t="0"/>
             <wp:docPr descr="Viterbi explainer: every value computed exactly and explained." title="" id="73" name="Picture"/>
             <a:graphic>
@@ -9983,7 +9824,7 @@
                   <pic:spPr bwMode="auto">
                     <a:xfrm>
                       <a:off x="0" y="0"/>
-                      <a:ext cx="4533900" cy="3379816"/>
+                      <a:ext cx="3253740" cy="2425515"/>
                     </a:xfrm>
                     <a:prstGeom prst="rect">
                       <a:avLst/>
@@ -10017,7 +9858,7 @@
       <w:r>
         <w:drawing>
           <wp:inline>
-            <wp:extent cx="5067300" cy="2850356"/>
+            <wp:extent cx="3627120" cy="2040255"/>
             <wp:effectExtent b="0" l="0" r="0" t="0"/>
             <wp:docPr descr="Interactive web deck: an AI-drawn diagram beside the slide content." title="" id="76" name="Picture"/>
             <a:graphic>
@@ -10038,7 +9879,7 @@
                   <pic:spPr bwMode="auto">
                     <a:xfrm>
                       <a:off x="0" y="0"/>
-                      <a:ext cx="5067300" cy="2850356"/>
+                      <a:ext cx="3627120" cy="2040255"/>
                     </a:xfrm>
                     <a:prstGeom prst="rect">
                       <a:avLst/>
@@ -10089,12 +9930,576 @@
         <w:pStyle w:val="FirstParagraph"/>
       </w:pPr>
       <w:r>
-        <w:t xml:space="preserve">The project has 755 automated tests that run in about 25 seconds. They cover each parser, each detector of the decision engine, the layout guarantees (no broken words, no overflow), the quiz rules, every solver, the laboratory policy, the diagram sanitiser, the key pool, the API endpoints and complete end-to-end generation. The tests always run without AI keys: the test configuration blanks every key, so that a key in the developer’s environment cannot change the results. In addition, an end-to-end script drives the running API with real files, a layout-audit tool checks finished PowerPoint files, and the gold sets measure the accuracy of the decision engine.</w:t>
+        <w:t xml:space="preserve">The project has 757 automated tests that run in about 25 seconds. They cover each parser, each detector of the decision engine, the layout guarantees (no broken words, no overflow), the quiz rules, every solver, the laboratory policy, the diagram sanitiser, the key pool, the API endpoints and complete end-to-end generation. The tests always run without AI keys: the test configuration blanks every key, so that a key in the developer’s environment cannot change the results. In addition, an end-to-end script drives the running API with real files, a layout-audit tool checks finished PowerPoint files, and the gold sets measure the accuracy of the decision engine.</w:t>
       </w:r>
     </w:p>
     <w:bookmarkEnd w:id="79"/>
+    <w:bookmarkStart w:id="80" w:name="Xb6d57fab5d43903feebf29604fe8d02ae4faa9f"/>
+    <w:p>
+      <w:pPr>
+        <w:pStyle w:val="Heading2"/>
+      </w:pPr>
+      <w:r>
+        <w:rPr>
+          <w:rStyle w:val="SectionNumber"/>
+        </w:rPr>
+        <w:t xml:space="preserve">6.6</w:t>
+      </w:r>
+      <w:r>
+        <w:tab/>
+      </w:r>
+      <w:r>
+        <w:t xml:space="preserve">Improvements after testing on the review decks</w:t>
+      </w:r>
+    </w:p>
+    <w:p>
+      <w:pPr>
+        <w:pStyle w:val="FirstParagraph"/>
+      </w:pPr>
+      <w:r>
+        <w:t xml:space="preserve">Before the final review we rebuilt the teachers’ own decks with the current code and inspected every page as a panel member</w:t>
+      </w:r>
+      <w:r>
+        <w:t xml:space="preserve"> </w:t>
+      </w:r>
+      <w:r>
+        <w:t xml:space="preserve">would. This round found problems that the automated tests had not covered, and each was fixed in the code, given a regression</w:t>
+      </w:r>
+      <w:r>
+        <w:t xml:space="preserve"> </w:t>
+      </w:r>
+      <w:r>
+        <w:t xml:space="preserve">test where possible, and pushed to the repository as a separate change. The table below summarises them.</w:t>
+      </w:r>
+    </w:p>
+    <w:p>
+      <w:pPr>
+        <w:pStyle w:val="TableCaption"/>
+      </w:pPr>
+      <w:r>
+        <w:t xml:space="preserve">Problems found on real decks and how they were fixed.</w:t>
+      </w:r>
+    </w:p>
+    <w:tbl>
+      <w:tblPr>
+        <w:tblStyle w:val="Table"/>
+        <w:tblW w:type="pct" w:w="5000"/>
+        <w:tblLayout w:type="fixed"/>
+        <w:tblLook w:firstRow="1" w:lastRow="0" w:firstColumn="0" w:lastColumn="0" w:noHBand="0" w:noVBand="0" w:val="0020"/>
+        <w:tblCaption w:val="Problems found on real decks and how they were fixed."/>
+      </w:tblPr>
+      <w:tblGrid>
+        <w:gridCol w:w="1980"/>
+        <w:gridCol w:w="1980"/>
+        <w:gridCol w:w="1980"/>
+        <w:gridCol w:w="1980"/>
+      </w:tblGrid>
+      <w:tr>
+        <w:trPr>
+          <w:tblHeader w:val="on"/>
+        </w:trPr>
+        <w:tc>
+          <w:tcPr/>
+          <w:p>
+            <w:pPr>
+              <w:pStyle w:val="Compact"/>
+            </w:pPr>
+            <w:r>
+              <w:t xml:space="preserve">Problem seen on the rebuilt deck</w:t>
+            </w:r>
+          </w:p>
+        </w:tc>
+        <w:tc>
+          <w:tcPr/>
+          <w:p>
+            <w:pPr>
+              <w:pStyle w:val="Compact"/>
+            </w:pPr>
+            <w:r>
+              <w:t xml:space="preserve">Cause</w:t>
+            </w:r>
+          </w:p>
+        </w:tc>
+        <w:tc>
+          <w:tcPr/>
+          <w:p>
+            <w:pPr>
+              <w:pStyle w:val="Compact"/>
+            </w:pPr>
+            <w:r>
+              <w:t xml:space="preserve">Change made</w:t>
+            </w:r>
+          </w:p>
+        </w:tc>
+        <w:tc>
+          <w:tcPr/>
+          <w:p>
+            <w:pPr>
+              <w:pStyle w:val="Compact"/>
+            </w:pPr>
+            <w:r>
+              <w:t xml:space="preserve">Effect</w:t>
+            </w:r>
+          </w:p>
+        </w:tc>
+      </w:tr>
+      <w:tr>
+        <w:tc>
+          <w:tcPr/>
+          <w:p>
+            <w:pPr>
+              <w:pStyle w:val="Compact"/>
+            </w:pPr>
+            <w:r>
+              <w:t xml:space="preserve">OCR scraps of pictures (</w:t>
+            </w:r>
+            <w:r>
+              <w:t xml:space="preserve">“M=0 1 ee”</w:t>
+            </w:r>
+            <w:r>
+              <w:t xml:space="preserve">, axis ticks) appeared as numbered points</w:t>
+            </w:r>
+          </w:p>
+        </w:tc>
+        <w:tc>
+          <w:tcPr/>
+          <w:p>
+            <w:pPr>
+              <w:pStyle w:val="Compact"/>
+            </w:pPr>
+            <w:r>
+              <w:t xml:space="preserve">text read from a figure was appended to the slide text</w:t>
+            </w:r>
+          </w:p>
+        </w:tc>
+        <w:tc>
+          <w:tcPr/>
+          <w:p>
+            <w:pPr>
+              <w:pStyle w:val="Compact"/>
+            </w:pPr>
+            <w:r>
+              <w:t xml:space="preserve">figure text is kept beside the slide and used only as a hint</w:t>
+            </w:r>
+          </w:p>
+        </w:tc>
+        <w:tc>
+          <w:tcPr/>
+          <w:p>
+            <w:pPr>
+              <w:pStyle w:val="Compact"/>
+            </w:pPr>
+            <w:r>
+              <w:t xml:space="preserve">no OCR debris on any slide of the test decks</w:t>
+            </w:r>
+          </w:p>
+        </w:tc>
+      </w:tr>
+      <w:tr>
+        <w:tc>
+          <w:tcPr/>
+          <w:p>
+            <w:pPr>
+              <w:pStyle w:val="Compact"/>
+            </w:pPr>
+            <w:r>
+              <w:t xml:space="preserve">A teacher’s build-up slides (same title, one more row each time) appeared three times</w:t>
+            </w:r>
+          </w:p>
+        </w:tc>
+        <w:tc>
+          <w:tcPr/>
+          <w:p>
+            <w:pPr>
+              <w:pStyle w:val="Compact"/>
+            </w:pPr>
+            <w:r>
+              <w:t xml:space="preserve">each exported page became a slide</w:t>
+            </w:r>
+          </w:p>
+        </w:tc>
+        <w:tc>
+          <w:tcPr/>
+          <w:p>
+            <w:pPr>
+              <w:pStyle w:val="Compact"/>
+            </w:pPr>
+            <w:r>
+              <w:t xml:space="preserve">a page whose words are 90% contained in the next page with the same title is dropped</w:t>
+            </w:r>
+          </w:p>
+        </w:tc>
+        <w:tc>
+          <w:tcPr/>
+          <w:p>
+            <w:pPr>
+              <w:pStyle w:val="Compact"/>
+            </w:pPr>
+            <w:r>
+              <w:t xml:space="preserve">“Advantages (1/3)… (3/3)”</w:t>
+            </w:r>
+            <w:r>
+              <w:t xml:space="preserve"> </w:t>
+            </w:r>
+            <w:r>
+              <w:t xml:space="preserve">became one complete slide</w:t>
+            </w:r>
+          </w:p>
+        </w:tc>
+      </w:tr>
+      <w:tr>
+        <w:tc>
+          <w:tcPr/>
+          <w:p>
+            <w:pPr>
+              <w:pStyle w:val="Compact"/>
+            </w:pPr>
+            <w:r>
+              <w:t xml:space="preserve">Algorithms and runs of equations were split into separate numbered cards</w:t>
+            </w:r>
+          </w:p>
+        </w:tc>
+        <w:tc>
+          <w:tcPr/>
+          <w:p>
+            <w:pPr>
+              <w:pStyle w:val="Compact"/>
+            </w:pPr>
+            <w:r>
+              <w:t xml:space="preserve">the generic card layout was chosen</w:t>
+            </w:r>
+          </w:p>
+        </w:tc>
+        <w:tc>
+          <w:tcPr/>
+          <w:p>
+            <w:pPr>
+              <w:pStyle w:val="Compact"/>
+            </w:pPr>
+            <w:r>
+              <w:t xml:space="preserve">new ALGORITHM visual: one panel, numbered lines, indentation kept, keywords highlighted, equations centred</w:t>
+            </w:r>
+          </w:p>
+        </w:tc>
+        <w:tc>
+          <w:tcPr/>
+          <w:p>
+            <w:pPr>
+              <w:pStyle w:val="Compact"/>
+            </w:pPr>
+            <w:r>
+              <w:t xml:space="preserve">pseudocode and derivations read top to bottom</w:t>
+            </w:r>
+          </w:p>
+        </w:tc>
+      </w:tr>
+      <w:tr>
+        <w:tc>
+          <w:tcPr/>
+          <w:p>
+            <w:pPr>
+              <w:pStyle w:val="Compact"/>
+            </w:pPr>
+            <w:r>
+              <w:t xml:space="preserve">The plain-words explanation sat in a 10 pt footer band</w:t>
+            </w:r>
+          </w:p>
+        </w:tc>
+        <w:tc>
+          <w:tcPr/>
+          <w:p>
+            <w:pPr>
+              <w:pStyle w:val="Compact"/>
+            </w:pPr>
+            <w:r>
+              <w:t xml:space="preserve">the footer carried all secondary text</w:t>
+            </w:r>
+          </w:p>
+        </w:tc>
+        <w:tc>
+          <w:tcPr/>
+          <w:p>
+            <w:pPr>
+              <w:pStyle w:val="Compact"/>
+            </w:pPr>
+            <w:r>
+              <w:t xml:space="preserve">an</w:t>
+            </w:r>
+            <w:r>
+              <w:t xml:space="preserve"> </w:t>
+            </w:r>
+            <w:r>
+              <w:t xml:space="preserve">“In plain words”</w:t>
+            </w:r>
+            <w:r>
+              <w:t xml:space="preserve"> </w:t>
+            </w:r>
+            <w:r>
+              <w:t xml:space="preserve">panel in the body, sized to its text at 11–14 pt, at most 40% of the area</w:t>
+            </w:r>
+          </w:p>
+        </w:tc>
+        <w:tc>
+          <w:tcPr/>
+          <w:p>
+            <w:pPr>
+              <w:pStyle w:val="Compact"/>
+            </w:pPr>
+            <w:r>
+              <w:t xml:space="preserve">explanations readable from the back of the room</w:t>
+            </w:r>
+          </w:p>
+        </w:tc>
+      </w:tr>
+      <w:tr>
+        <w:tc>
+          <w:tcPr/>
+          <w:p>
+            <w:pPr>
+              <w:pStyle w:val="Compact"/>
+            </w:pPr>
+            <w:r>
+              <w:t xml:space="preserve">Captions under figures showed unreadable OCR</w:t>
+            </w:r>
+          </w:p>
+        </w:tc>
+        <w:tc>
+          <w:tcPr/>
+          <w:p>
+            <w:pPr>
+              <w:pStyle w:val="Compact"/>
+            </w:pPr>
+            <w:r>
+              <w:t xml:space="preserve">OCR output was always used as the caption</w:t>
+            </w:r>
+          </w:p>
+        </w:tc>
+        <w:tc>
+          <w:tcPr/>
+          <w:p>
+            <w:pPr>
+              <w:pStyle w:val="Compact"/>
+            </w:pPr>
+            <w:r>
+              <w:t xml:space="preserve">a caption is shown only when most of its words are dictionary words</w:t>
+            </w:r>
+          </w:p>
+        </w:tc>
+        <w:tc>
+          <w:tcPr/>
+          <w:p>
+            <w:pPr>
+              <w:pStyle w:val="Compact"/>
+            </w:pPr>
+            <w:r>
+              <w:t xml:space="preserve">no garbled captions</w:t>
+            </w:r>
+          </w:p>
+        </w:tc>
+      </w:tr>
+      <w:tr>
+        <w:tc>
+          <w:tcPr/>
+          <w:p>
+            <w:pPr>
+              <w:pStyle w:val="Compact"/>
+            </w:pPr>
+            <w:r>
+              <w:t xml:space="preserve">AI diagrams rendered with black boxes</w:t>
+            </w:r>
+          </w:p>
+        </w:tc>
+        <w:tc>
+          <w:tcPr/>
+          <w:p>
+            <w:pPr>
+              <w:pStyle w:val="Compact"/>
+            </w:pPr>
+            <w:r>
+              <w:t xml:space="preserve">the PDF library cannot paint SVG gradients</w:t>
+            </w:r>
+          </w:p>
+        </w:tc>
+        <w:tc>
+          <w:tcPr/>
+          <w:p>
+            <w:pPr>
+              <w:pStyle w:val="Compact"/>
+            </w:pPr>
+            <w:r>
+              <w:t xml:space="preserve">diagrams rendered with resvg; gradients flattened when it is missing</w:t>
+            </w:r>
+          </w:p>
+        </w:tc>
+        <w:tc>
+          <w:tcPr/>
+          <w:p>
+            <w:pPr>
+              <w:pStyle w:val="Compact"/>
+            </w:pPr>
+            <w:r>
+              <w:t xml:space="preserve">diagrams look as designed</w:t>
+            </w:r>
+          </w:p>
+        </w:tc>
+      </w:tr>
+    </w:tbl>
+    <w:p>
+      <w:pPr>
+        <w:pStyle w:val="BodyText"/>
+      </w:pPr>
+      <w:r>
+        <w:t xml:space="preserve">The illustrations were also redesigned. Each slide is first classified into the kind of figure that would teach it — a</w:t>
+      </w:r>
+      <w:r>
+        <w:t xml:space="preserve"> </w:t>
+      </w:r>
+      <w:r>
+        <w:rPr>
+          <w:i/>
+          <w:iCs/>
+        </w:rPr>
+        <w:t xml:space="preserve">flow</w:t>
+      </w:r>
+      <w:r>
+        <w:t xml:space="preserve"> </w:t>
+      </w:r>
+      <w:r>
+        <w:t xml:space="preserve">for processes and apparatus, a</w:t>
+      </w:r>
+      <w:r>
+        <w:t xml:space="preserve"> </w:t>
+      </w:r>
+      <w:r>
+        <w:rPr>
+          <w:i/>
+          <w:iCs/>
+        </w:rPr>
+        <w:t xml:space="preserve">plot</w:t>
+      </w:r>
+      <w:r>
+        <w:t xml:space="preserve"> </w:t>
+      </w:r>
+      <w:r>
+        <w:t xml:space="preserve">for quantitative relations, an</w:t>
+      </w:r>
+      <w:r>
+        <w:t xml:space="preserve"> </w:t>
+      </w:r>
+      <w:r>
+        <w:rPr>
+          <w:i/>
+          <w:iCs/>
+        </w:rPr>
+        <w:t xml:space="preserve">anatomy</w:t>
+      </w:r>
+      <w:r>
+        <w:t xml:space="preserve"> </w:t>
+      </w:r>
+      <w:r>
+        <w:t xml:space="preserve">for parts and types, a</w:t>
+      </w:r>
+      <w:r>
+        <w:t xml:space="preserve"> </w:t>
+      </w:r>
+      <w:r>
+        <w:rPr>
+          <w:i/>
+          <w:iCs/>
+        </w:rPr>
+        <w:t xml:space="preserve">comparison</w:t>
+      </w:r>
+      <w:r>
+        <w:t xml:space="preserve">, or a</w:t>
+      </w:r>
+      <w:r>
+        <w:t xml:space="preserve"> </w:t>
+      </w:r>
+      <w:r>
+        <w:t xml:space="preserve">concrete</w:t>
+      </w:r>
+      <w:r>
+        <w:t xml:space="preserve"> </w:t>
+      </w:r>
+      <w:r>
+        <w:rPr>
+          <w:i/>
+          <w:iCs/>
+        </w:rPr>
+        <w:t xml:space="preserve">scene</w:t>
+      </w:r>
+      <w:r>
+        <w:t xml:space="preserve"> </w:t>
+      </w:r>
+      <w:r>
+        <w:t xml:space="preserve">— and slides where a drawing adds nothing (agendas, references, quizzes, tables, algorithms, slides that are</w:t>
+      </w:r>
+      <w:r>
+        <w:t xml:space="preserve"> </w:t>
+      </w:r>
+      <w:r>
+        <w:t xml:space="preserve">already figures) get none. The prompt asks for six to fourteen labels, the slide’s own numbers and three to six numbered parts,</w:t>
+      </w:r>
+      <w:r>
+        <w:t xml:space="preserve"> </w:t>
+      </w:r>
+      <w:r>
+        <w:t xml:space="preserve">each grouped with a short title. The linked HTML page uses those groups to step through the figure part by part, and a part</w:t>
+      </w:r>
+      <w:r>
+        <w:t xml:space="preserve"> </w:t>
+      </w:r>
+      <w:r>
+        <w:t xml:space="preserve">can be highlighted by pointing at it, so the illustration is something a student explores rather than a static picture.</w:t>
+      </w:r>
+      <w:r>
+        <w:t xml:space="preserve"> </w:t>
+      </w:r>
+      <w:r>
+        <w:t xml:space="preserve">Appendix A shows the Haber process plant drawn this way: the gas sources, the compressor at 200 atmospheres, the</w:t>
+      </w:r>
+      <w:r>
+        <w:t xml:space="preserve"> </w:t>
+      </w:r>
+      <w:r>
+        <w:t xml:space="preserve">reactor with its iron catalyst at 450 °C, the condenser and the recycle loop, each numbered in teaching order.</w:t>
+      </w:r>
+    </w:p>
+    <w:p>
+      <w:pPr>
+        <w:pStyle w:val="BodyText"/>
+      </w:pPr>
+      <w:r>
+        <w:t xml:space="preserve">Two further gaps were closed. Problem slides that none of the sixteen exact solvers recognises now receive a step-by-step</w:t>
+      </w:r>
+      <w:r>
+        <w:t xml:space="preserve"> </w:t>
+      </w:r>
+      <w:r>
+        <w:t xml:space="preserve">explanation written by the language model, at most six per deck, and the page states that these steps were not computed by</w:t>
+      </w:r>
+      <w:r>
+        <w:t xml:space="preserve"> </w:t>
+      </w:r>
+      <w:r>
+        <w:t xml:space="preserve">Learnova. Second, the project can now be deployed: a Dockerfile builds one container with the API, the web application,</w:t>
+      </w:r>
+      <w:r>
+        <w:t xml:space="preserve"> </w:t>
+      </w:r>
+      <w:r>
+        <w:t xml:space="preserve">LibreOffice, Tesseract and an English dictionary; a Render blueprint creates the service, and a Vercel configuration forwards</w:t>
+      </w:r>
+      <w:r>
+        <w:t xml:space="preserve"> </w:t>
+      </w:r>
+      <w:r>
+        <w:t xml:space="preserve">the web application’s API calls when the two are hosted separately.</w:t>
+      </w:r>
+    </w:p>
     <w:bookmarkEnd w:id="80"/>
-    <w:bookmarkStart w:id="115" w:name="results-and-evaluation"/>
+    <w:bookmarkEnd w:id="81"/>
+    <w:bookmarkStart w:id="116" w:name="results-and-evaluation"/>
     <w:p>
       <w:pPr>
         <w:pStyle w:val="Heading1"/>
@@ -10112,7 +10517,7 @@
         <w:t xml:space="preserve">Results and Evaluation</w:t>
       </w:r>
     </w:p>
-    <w:bookmarkStart w:id="81" w:name="evaluation-setup"/>
+    <w:bookmarkStart w:id="82" w:name="evaluation-setup"/>
     <w:p>
       <w:pPr>
         <w:pStyle w:val="Heading2"/>
@@ -10170,8 +10575,8 @@
         <w:t xml:space="preserve">are lecture decks from our own courses: two machine-learning PowerPoint files (28 and 63 slides), four slide PDFs (36, 44, 95 and 216 pages) and two Word documents of notes. All timings were measured on a laptop.</w:t>
       </w:r>
     </w:p>
-    <w:bookmarkEnd w:id="81"/>
-    <w:bookmarkStart w:id="85" w:name="visual-decision-accuracy"/>
+    <w:bookmarkEnd w:id="82"/>
+    <w:bookmarkStart w:id="86" w:name="visual-decision-accuracy"/>
     <w:p>
       <w:pPr>
         <w:pStyle w:val="Heading2"/>
@@ -10467,20 +10872,20 @@
       <w:r>
         <w:drawing>
           <wp:inline>
-            <wp:extent cx="3215013" cy="2572010"/>
+            <wp:extent cx="2667000" cy="2133600"/>
             <wp:effectExtent b="0" l="0" r="0" t="0"/>
-            <wp:docPr descr="Visual families chosen over the rebuilt decks." title="" id="83" name="Picture"/>
+            <wp:docPr descr="Visual families chosen over the rebuilt decks." title="" id="84" name="Picture"/>
             <a:graphic>
               <a:graphicData uri="http://schemas.openxmlformats.org/drawingml/2006/picture">
                 <pic:pic>
                   <pic:nvPicPr>
-                    <pic:cNvPr descr="img/fig_families.png" id="84" name="Picture"/>
+                    <pic:cNvPr descr="img/fig_families.png" id="85" name="Picture"/>
                     <pic:cNvPicPr>
                       <a:picLocks noChangeArrowheads="1" noChangeAspect="1"/>
                     </pic:cNvPicPr>
                   </pic:nvPicPr>
                   <pic:blipFill>
-                    <a:blip r:embed="rId82"/>
+                    <a:blip r:embed="rId83"/>
                     <a:stretch>
                       <a:fillRect/>
                     </a:stretch>
@@ -10488,7 +10893,7 @@
                   <pic:spPr bwMode="auto">
                     <a:xfrm>
                       <a:off x="0" y="0"/>
-                      <a:ext cx="3215013" cy="2572010"/>
+                      <a:ext cx="2667000" cy="2133600"/>
                     </a:xfrm>
                     <a:prstGeom prst="rect">
                       <a:avLst/>
@@ -10515,8 +10920,8 @@
         <w:t xml:space="preserve">Visual families chosen over the rebuilt decks.</w:t>
       </w:r>
     </w:p>
-    <w:bookmarkEnd w:id="85"/>
-    <w:bookmarkStart w:id="92" w:name="fidelity-layout-and-speed"/>
+    <w:bookmarkEnd w:id="86"/>
+    <w:bookmarkStart w:id="93" w:name="fidelity-layout-and-speed"/>
     <w:p>
       <w:pPr>
         <w:pStyle w:val="Heading2"/>
@@ -11175,20 +11580,20 @@
       <w:r>
         <w:drawing>
           <wp:inline>
-            <wp:extent cx="3215013" cy="2388295"/>
+            <wp:extent cx="2506980" cy="1862328"/>
             <wp:effectExtent b="0" l="0" r="0" t="0"/>
-            <wp:docPr descr="Time from upload to finished files against source length." title="" id="87" name="Picture"/>
+            <wp:docPr descr="Time from upload to finished files against source length." title="" id="88" name="Picture"/>
             <a:graphic>
               <a:graphicData uri="http://schemas.openxmlformats.org/drawingml/2006/picture">
                 <pic:pic>
                   <pic:nvPicPr>
-                    <pic:cNvPr descr="img/fig_time.png" id="88" name="Picture"/>
+                    <pic:cNvPr descr="img/fig_time.png" id="89" name="Picture"/>
                     <pic:cNvPicPr>
                       <a:picLocks noChangeArrowheads="1" noChangeAspect="1"/>
                     </pic:cNvPicPr>
                   </pic:nvPicPr>
                   <pic:blipFill>
-                    <a:blip r:embed="rId86"/>
+                    <a:blip r:embed="rId87"/>
                     <a:stretch>
                       <a:fillRect/>
                     </a:stretch>
@@ -11196,7 +11601,7 @@
                   <pic:spPr bwMode="auto">
                     <a:xfrm>
                       <a:off x="0" y="0"/>
-                      <a:ext cx="3215013" cy="2388295"/>
+                      <a:ext cx="2506980" cy="1862328"/>
                     </a:xfrm>
                     <a:prstGeom prst="rect">
                       <a:avLst/>
@@ -11238,20 +11643,20 @@
       <w:r>
         <w:drawing>
           <wp:inline>
-            <wp:extent cx="3200400" cy="2194560"/>
+            <wp:extent cx="2293620" cy="1572768"/>
             <wp:effectExtent b="0" l="0" r="0" t="0"/>
-            <wp:docPr descr="Time for a 36-page deck in different modes." title="" id="90" name="Picture"/>
+            <wp:docPr descr="Time for a 36-page deck in different modes." title="" id="91" name="Picture"/>
             <a:graphic>
               <a:graphicData uri="http://schemas.openxmlformats.org/drawingml/2006/picture">
                 <pic:pic>
                   <pic:nvPicPr>
-                    <pic:cNvPr descr="img/fig_modes.png" id="91" name="Picture"/>
+                    <pic:cNvPr descr="img/fig_modes.png" id="92" name="Picture"/>
                     <pic:cNvPicPr>
                       <a:picLocks noChangeArrowheads="1" noChangeAspect="1"/>
                     </pic:cNvPicPr>
                   </pic:nvPicPr>
                   <pic:blipFill>
-                    <a:blip r:embed="rId89"/>
+                    <a:blip r:embed="rId90"/>
                     <a:stretch>
                       <a:fillRect/>
                     </a:stretch>
@@ -11259,7 +11664,7 @@
                   <pic:spPr bwMode="auto">
                     <a:xfrm>
                       <a:off x="0" y="0"/>
-                      <a:ext cx="3200400" cy="2194560"/>
+                      <a:ext cx="2293620" cy="1572768"/>
                     </a:xfrm>
                     <a:prstGeom prst="rect">
                       <a:avLst/>
@@ -11286,8 +11691,8 @@
         <w:t xml:space="preserve">Time for a 36-page deck in different modes.</w:t>
       </w:r>
     </w:p>
-    <w:bookmarkEnd w:id="92"/>
-    <w:bookmarkStart w:id="102" w:name="before-and-after"/>
+    <w:bookmarkEnd w:id="93"/>
+    <w:bookmarkStart w:id="103" w:name="before-and-after"/>
     <w:p>
       <w:pPr>
         <w:pStyle w:val="Heading2"/>
@@ -11907,20 +12312,20 @@
       <w:r>
         <w:drawing>
           <wp:inline>
-            <wp:extent cx="5334000" cy="1852083"/>
+            <wp:extent cx="3840480" cy="1333500"/>
             <wp:effectExtent b="0" l="0" r="0" t="0"/>
-            <wp:docPr descr="Structure of the source decks and the rebuilt decks." title="" id="94" name="Picture"/>
+            <wp:docPr descr="Structure of the source decks and the rebuilt decks." title="" id="95" name="Picture"/>
             <a:graphic>
               <a:graphicData uri="http://schemas.openxmlformats.org/drawingml/2006/picture">
                 <pic:pic>
                   <pic:nvPicPr>
-                    <pic:cNvPr descr="img/fig_before_after.png" id="95" name="Picture"/>
+                    <pic:cNvPr descr="img/fig_before_after.png" id="96" name="Picture"/>
                     <pic:cNvPicPr>
                       <a:picLocks noChangeArrowheads="1" noChangeAspect="1"/>
                     </pic:cNvPicPr>
                   </pic:nvPicPr>
                   <pic:blipFill>
-                    <a:blip r:embed="rId93"/>
+                    <a:blip r:embed="rId94"/>
                     <a:stretch>
                       <a:fillRect/>
                     </a:stretch>
@@ -11928,7 +12333,7 @@
                   <pic:spPr bwMode="auto">
                     <a:xfrm>
                       <a:off x="0" y="0"/>
-                      <a:ext cx="5334000" cy="1852083"/>
+                      <a:ext cx="3840480" cy="1333500"/>
                     </a:xfrm>
                     <a:prstGeom prst="rect">
                       <a:avLst/>
@@ -11962,20 +12367,20 @@
       <w:r>
         <w:drawing>
           <wp:inline>
-            <wp:extent cx="3733800" cy="2103966"/>
+            <wp:extent cx="2667000" cy="1502833"/>
             <wp:effectExtent b="0" l="0" r="0" t="0"/>
-            <wp:docPr descr="Before: an original slide." title="" id="97" name="Picture"/>
+            <wp:docPr descr="Before: an original slide." title="" id="98" name="Picture"/>
             <a:graphic>
               <a:graphicData uri="http://schemas.openxmlformats.org/drawingml/2006/picture">
                 <pic:pic>
                   <pic:nvPicPr>
-                    <pic:cNvPr descr="img/pair1_before.png" id="98" name="Picture"/>
+                    <pic:cNvPr descr="img/pair1_before.png" id="99" name="Picture"/>
                     <pic:cNvPicPr>
                       <a:picLocks noChangeArrowheads="1" noChangeAspect="1"/>
                     </pic:cNvPicPr>
                   </pic:nvPicPr>
                   <pic:blipFill>
-                    <a:blip r:embed="rId96"/>
+                    <a:blip r:embed="rId97"/>
                     <a:stretch>
                       <a:fillRect/>
                     </a:stretch>
@@ -11983,7 +12388,7 @@
                   <pic:spPr bwMode="auto">
                     <a:xfrm>
                       <a:off x="0" y="0"/>
-                      <a:ext cx="3733800" cy="2103966"/>
+                      <a:ext cx="2667000" cy="1502833"/>
                     </a:xfrm>
                     <a:prstGeom prst="rect">
                       <a:avLst/>
@@ -12017,20 +12422,20 @@
       <w:r>
         <w:drawing>
           <wp:inline>
-            <wp:extent cx="4267200" cy="2400300"/>
+            <wp:extent cx="3093720" cy="1740217"/>
             <wp:effectExtent b="0" l="0" r="0" t="0"/>
-            <wp:docPr descr="After: the same slide rebuilt by Learnova, with an assertion title, full text, the teacher’s figure and key terms." title="" id="100" name="Picture"/>
+            <wp:docPr descr="After: the same slide rebuilt by Learnova, with an assertion title, full text, the teacher’s figure and key terms." title="" id="101" name="Picture"/>
             <a:graphic>
               <a:graphicData uri="http://schemas.openxmlformats.org/drawingml/2006/picture">
                 <pic:pic>
                   <pic:nvPicPr>
-                    <pic:cNvPr descr="img/pair1_after.png" id="101" name="Picture"/>
+                    <pic:cNvPr descr="img/pair1_after.png" id="102" name="Picture"/>
                     <pic:cNvPicPr>
                       <a:picLocks noChangeArrowheads="1" noChangeAspect="1"/>
                     </pic:cNvPicPr>
                   </pic:nvPicPr>
                   <pic:blipFill>
-                    <a:blip r:embed="rId99"/>
+                    <a:blip r:embed="rId100"/>
                     <a:stretch>
                       <a:fillRect/>
                     </a:stretch>
@@ -12038,7 +12443,7 @@
                   <pic:spPr bwMode="auto">
                     <a:xfrm>
                       <a:off x="0" y="0"/>
-                      <a:ext cx="4267200" cy="2400300"/>
+                      <a:ext cx="3093720" cy="1740217"/>
                     </a:xfrm>
                     <a:prstGeom prst="rect">
                       <a:avLst/>
@@ -12065,8 +12470,8 @@
         <w:t xml:space="preserve">After: the same slide rebuilt by Learnova, with an assertion title, full text, the teacher’s figure and key terms.</w:t>
       </w:r>
     </w:p>
-    <w:bookmarkEnd w:id="102"/>
-    <w:bookmarkStart w:id="109" w:name="psf-and-class"/>
+    <w:bookmarkEnd w:id="103"/>
+    <w:bookmarkStart w:id="110" w:name="psf-and-class"/>
     <w:p>
       <w:pPr>
         <w:pStyle w:val="Heading2"/>
@@ -12099,20 +12504,20 @@
       <w:r>
         <w:drawing>
           <wp:inline>
-            <wp:extent cx="5334000" cy="1926166"/>
+            <wp:extent cx="3840480" cy="1386840"/>
             <wp:effectExtent b="0" l="0" r="0" t="0"/>
-            <wp:docPr descr="Mean PSF and mean estimated cognitive load of each source deck and its rebuilt deck." title="" id="104" name="Picture"/>
+            <wp:docPr descr="Mean PSF and mean estimated cognitive load of each source deck and its rebuilt deck." title="" id="105" name="Picture"/>
             <a:graphic>
               <a:graphicData uri="http://schemas.openxmlformats.org/drawingml/2006/picture">
                 <pic:pic>
                   <pic:nvPicPr>
-                    <pic:cNvPr descr="img/fig_psf.png" id="105" name="Picture"/>
+                    <pic:cNvPr descr="img/fig_psf.png" id="106" name="Picture"/>
                     <pic:cNvPicPr>
                       <a:picLocks noChangeArrowheads="1" noChangeAspect="1"/>
                     </pic:cNvPicPr>
                   </pic:nvPicPr>
                   <pic:blipFill>
-                    <a:blip r:embed="rId103"/>
+                    <a:blip r:embed="rId104"/>
                     <a:stretch>
                       <a:fillRect/>
                     </a:stretch>
@@ -12120,7 +12525,7 @@
                   <pic:spPr bwMode="auto">
                     <a:xfrm>
                       <a:off x="0" y="0"/>
-                      <a:ext cx="5334000" cy="1926166"/>
+                      <a:ext cx="3840480" cy="1386840"/>
                     </a:xfrm>
                     <a:prstGeom prst="rect">
                       <a:avLst/>
@@ -12162,20 +12567,20 @@
       <w:r>
         <w:drawing>
           <wp:inline>
-            <wp:extent cx="3200400" cy="2377440"/>
+            <wp:extent cx="2293620" cy="1703831"/>
             <wp:effectExtent b="0" l="0" r="0" t="0"/>
-            <wp:docPr descr="Total cost per overloaded section, CLASS against even splitting." title="" id="107" name="Picture"/>
+            <wp:docPr descr="Total cost per overloaded section, CLASS against even splitting." title="" id="108" name="Picture"/>
             <a:graphic>
               <a:graphicData uri="http://schemas.openxmlformats.org/drawingml/2006/picture">
                 <pic:pic>
                   <pic:nvPicPr>
-                    <pic:cNvPr descr="img/fig_class.png" id="108" name="Picture"/>
+                    <pic:cNvPr descr="img/fig_class.png" id="109" name="Picture"/>
                     <pic:cNvPicPr>
                       <a:picLocks noChangeArrowheads="1" noChangeAspect="1"/>
                     </pic:cNvPicPr>
                   </pic:nvPicPr>
                   <pic:blipFill>
-                    <a:blip r:embed="rId106"/>
+                    <a:blip r:embed="rId107"/>
                     <a:stretch>
                       <a:fillRect/>
                     </a:stretch>
@@ -12183,7 +12588,7 @@
                   <pic:spPr bwMode="auto">
                     <a:xfrm>
                       <a:off x="0" y="0"/>
-                      <a:ext cx="3200400" cy="2377440"/>
+                      <a:ext cx="2293620" cy="1703831"/>
                     </a:xfrm>
                     <a:prstGeom prst="rect">
                       <a:avLst/>
@@ -12210,8 +12615,8 @@
         <w:t xml:space="preserve">Total cost per overloaded section, CLASS against even splitting.</w:t>
       </w:r>
     </w:p>
-    <w:bookmarkEnd w:id="109"/>
-    <w:bookmarkStart w:id="113" w:name="step-by-step-explainers-1"/>
+    <w:bookmarkEnd w:id="110"/>
+    <w:bookmarkStart w:id="114" w:name="step-by-step-explainers-1"/>
     <w:p>
       <w:pPr>
         <w:pStyle w:val="Heading2"/>
@@ -12240,7 +12645,7 @@
         <w:t xml:space="preserve">“Find x if 4x + 9 = x + 21”</w:t>
       </w:r>
       <w:r>
-        <w:t xml:space="preserve">) was added, after which all 26 were detected, classified and answered correctly, and every step carried a reason. None of 12 ordinary lecture sentences was mistaken for a problem. The median time per problem was 0.7 milliseconds. During this exercise two of our own hand-worked answers turned out to be wrong, and the solvers were right in both cases.</w:t>
+        <w:t xml:space="preserve">) was added, after which all 26 were detected, classified and answered correctly, and every step carried a reason. None of 52 ordinary sentences (12 from lecture notes and 40 written to resemble problems) was mistaken for a problem. The median time per problem was 0.7 milliseconds. During this exercise two of our own hand-worked answers turned out to be wrong, and the solvers were right in both cases.</w:t>
       </w:r>
     </w:p>
     <w:p>
@@ -12250,20 +12655,20 @@
       <w:r>
         <w:drawing>
           <wp:inline>
-            <wp:extent cx="3215013" cy="2572010"/>
+            <wp:extent cx="2506980" cy="2005584"/>
             <wp:effectExtent b="0" l="0" r="0" t="0"/>
-            <wp:docPr descr="Average explainer length by problem type." title="" id="111" name="Picture"/>
+            <wp:docPr descr="Average explainer length by problem type." title="" id="112" name="Picture"/>
             <a:graphic>
               <a:graphicData uri="http://schemas.openxmlformats.org/drawingml/2006/picture">
                 <pic:pic>
                   <pic:nvPicPr>
-                    <pic:cNvPr descr="img/fig_steps.png" id="112" name="Picture"/>
+                    <pic:cNvPr descr="img/fig_steps.png" id="113" name="Picture"/>
                     <pic:cNvPicPr>
                       <a:picLocks noChangeArrowheads="1" noChangeAspect="1"/>
                     </pic:cNvPicPr>
                   </pic:nvPicPr>
                   <pic:blipFill>
-                    <a:blip r:embed="rId110"/>
+                    <a:blip r:embed="rId111"/>
                     <a:stretch>
                       <a:fillRect/>
                     </a:stretch>
@@ -12271,7 +12676,7 @@
                   <pic:spPr bwMode="auto">
                     <a:xfrm>
                       <a:off x="0" y="0"/>
-                      <a:ext cx="3215013" cy="2572010"/>
+                      <a:ext cx="2506980" cy="2005584"/>
                     </a:xfrm>
                     <a:prstGeom prst="rect">
                       <a:avLst/>
@@ -12298,8 +12703,8 @@
         <w:t xml:space="preserve">Average explainer length by problem type.</w:t>
       </w:r>
     </w:p>
-    <w:bookmarkEnd w:id="113"/>
-    <w:bookmarkStart w:id="114" w:name="illustrations"/>
+    <w:bookmarkEnd w:id="114"/>
+    <w:bookmarkStart w:id="115" w:name="illustrations"/>
     <w:p>
       <w:pPr>
         <w:pStyle w:val="Heading2"/>
@@ -12325,9 +12730,9 @@
         <w:t xml:space="preserve">Without a key, every topic slide receives an offline illustration. With the five-key pool, ten diagrams were written and accepted in 10.1 seconds in parallel. Before we replaced outright rejection with sanitisation, only 71 of 206 model answers (34.5%) passed validation, most of them failing because of inline styles and gradients; after the change all diagrams of a live check were accepted.</w:t>
       </w:r>
     </w:p>
-    <w:bookmarkEnd w:id="114"/>
     <w:bookmarkEnd w:id="115"/>
-    <w:bookmarkStart w:id="116" w:name="X264e4055afaae0192743c9c9b1fe0e354004687"/>
+    <w:bookmarkEnd w:id="116"/>
+    <w:bookmarkStart w:id="117" w:name="X264e4055afaae0192743c9c9b1fe0e354004687"/>
     <w:p>
       <w:pPr>
         <w:pStyle w:val="Heading1"/>
@@ -12489,8 +12894,8 @@
         <w:t xml:space="preserve">Text is measured glyph by glyph, so nothing overflows and no word is ever split across lines.</w:t>
       </w:r>
     </w:p>
-    <w:bookmarkEnd w:id="116"/>
-    <w:bookmarkStart w:id="120" w:name="conclusion-and-future-scope"/>
+    <w:bookmarkEnd w:id="117"/>
+    <w:bookmarkStart w:id="121" w:name="conclusion-and-future-scope"/>
     <w:p>
       <w:pPr>
         <w:pStyle w:val="Heading1"/>
@@ -12508,7 +12913,7 @@
         <w:t xml:space="preserve">Conclusion and Future Scope</w:t>
       </w:r>
     </w:p>
-    <w:bookmarkStart w:id="117" w:name="conclusion"/>
+    <w:bookmarkStart w:id="118" w:name="conclusion"/>
     <w:p>
       <w:pPr>
         <w:pStyle w:val="Heading2"/>
@@ -12534,8 +12939,8 @@
         <w:t xml:space="preserve">Learnova shows that the decks teachers already use can be turned into clear, illustrated and interactive lessons automatically without losing what they say. By treating the source content as fixed and making every structural decision with an explicit rule, the system kept 98–100% of the facts of real course decks, removed every untitled slide, chose an appropriate visual for about 97% of slides and never broke a word across lines. Language models are used only where their output can be checked — titles, explanations, diagrams and laboratories — and the system continues to work when every key is exhausted. Two original methods, the PSF metric and the CLASS segmentation algorithm, connect the design of the system to research on cognitive load and multimedia learning. The work has been written up as two research papers, one in IEEE conference format and one in Springer LNCS format.</w:t>
       </w:r>
     </w:p>
-    <w:bookmarkEnd w:id="117"/>
-    <w:bookmarkStart w:id="118" w:name="limitations"/>
+    <w:bookmarkEnd w:id="118"/>
+    <w:bookmarkStart w:id="119" w:name="limitations"/>
     <w:p>
       <w:pPr>
         <w:pStyle w:val="Heading2"/>
@@ -12561,8 +12966,8 @@
         <w:t xml:space="preserve">The decision engine covers the structures we have written detectors for; slides whose meaning lies mainly in a picture still depend on the original figure. OCR of photographed equations is unreliable, which is why such pictures are kept rather than transcribed. Without an API key, slides that are thin in the source remain thin, because the system does not invent content. PSF’s weights are taken from the literature and have not yet been calibrated against student judgements, and we have not yet run a controlled study of learning outcomes.</w:t>
       </w:r>
     </w:p>
-    <w:bookmarkEnd w:id="118"/>
-    <w:bookmarkStart w:id="119" w:name="future-scope"/>
+    <w:bookmarkEnd w:id="119"/>
+    <w:bookmarkStart w:id="120" w:name="future-scope"/>
     <w:p>
       <w:pPr>
         <w:pStyle w:val="Heading2"/>
@@ -12664,9 +13069,9 @@
         <w:t xml:space="preserve">Deployment as a department service: the front end on a static host and the back end in a container with LibreOffice and Tesseract on a server with persistent storage.</w:t>
       </w:r>
     </w:p>
-    <w:bookmarkEnd w:id="119"/>
     <w:bookmarkEnd w:id="120"/>
-    <w:bookmarkStart w:id="121" w:name="references"/>
+    <w:bookmarkEnd w:id="121"/>
+    <w:bookmarkStart w:id="122" w:name="references"/>
     <w:p>
       <w:pPr>
         <w:pStyle w:val="Heading1"/>
@@ -13424,8 +13829,8 @@
         <w:t xml:space="preserve">https://revealjs.com, accessed October 2026.</w:t>
       </w:r>
     </w:p>
-    <w:bookmarkEnd w:id="121"/>
-    <w:bookmarkStart w:id="134" w:name="appendix-a-sample-outputs"/>
+    <w:bookmarkEnd w:id="122"/>
+    <w:bookmarkStart w:id="138" w:name="appendix-a-sample-outputs"/>
     <w:p>
       <w:pPr>
         <w:pStyle w:val="Heading1"/>
@@ -13441,20 +13846,20 @@
       <w:r>
         <w:drawing>
           <wp:inline>
-            <wp:extent cx="2133600" cy="4619955"/>
+            <wp:extent cx="2133600" cy="2560320"/>
             <wp:effectExtent b="0" l="0" r="0" t="0"/>
-            <wp:docPr descr="Phone layout of the application." title="" id="123" name="Picture"/>
+            <wp:docPr descr="AI illustration of the Haber process plant: five numbered parts that the linked page reveals in order." title="" id="124" name="Picture"/>
             <a:graphic>
               <a:graphicData uri="http://schemas.openxmlformats.org/drawingml/2006/picture">
                 <pic:pic>
                   <pic:nvPicPr>
-                    <pic:cNvPr descr="img/mobile-home.jpg" id="124" name="Picture"/>
+                    <pic:cNvPr descr="img/haber_diagram.png" id="125" name="Picture"/>
                     <pic:cNvPicPr>
                       <a:picLocks noChangeArrowheads="1" noChangeAspect="1"/>
                     </pic:cNvPicPr>
                   </pic:nvPicPr>
                   <pic:blipFill>
-                    <a:blip r:embed="rId122"/>
+                    <a:blip r:embed="rId123"/>
                     <a:stretch>
                       <a:fillRect/>
                     </a:stretch>
@@ -13462,7 +13867,7 @@
                   <pic:spPr bwMode="auto">
                     <a:xfrm>
                       <a:off x="0" y="0"/>
-                      <a:ext cx="2133600" cy="4619955"/>
+                      <a:ext cx="2133600" cy="2560320"/>
                     </a:xfrm>
                     <a:prstGeom prst="rect">
                       <a:avLst/>
@@ -13486,7 +13891,7 @@
         <w:pStyle w:val="ImageCaption"/>
       </w:pPr>
       <w:r>
-        <w:t xml:space="preserve">Phone layout of the application.</w:t>
+        <w:t xml:space="preserve">AI illustration of the Haber process plant: five numbered parts that the linked page reveals in order.</w:t>
       </w:r>
     </w:p>
     <w:p>
@@ -13496,20 +13901,20 @@
       <w:r>
         <w:drawing>
           <wp:inline>
-            <wp:extent cx="4533900" cy="3589337"/>
+            <wp:extent cx="1866900" cy="4042460"/>
             <wp:effectExtent b="0" l="0" r="0" t="0"/>
-            <wp:docPr descr="Region Splitting and Merging laboratory built on the shared laboratory bench." title="" id="126" name="Picture"/>
+            <wp:docPr descr="Phone layout of the application." title="" id="127" name="Picture"/>
             <a:graphic>
               <a:graphicData uri="http://schemas.openxmlformats.org/drawingml/2006/picture">
                 <pic:pic>
                   <pic:nvPicPr>
-                    <pic:cNvPr descr="img/lab_split.png" id="127" name="Picture"/>
+                    <pic:cNvPr descr="img/mobile-home.jpg" id="128" name="Picture"/>
                     <pic:cNvPicPr>
                       <a:picLocks noChangeArrowheads="1" noChangeAspect="1"/>
                     </pic:cNvPicPr>
                   </pic:nvPicPr>
                   <pic:blipFill>
-                    <a:blip r:embed="rId125"/>
+                    <a:blip r:embed="rId126"/>
                     <a:stretch>
                       <a:fillRect/>
                     </a:stretch>
@@ -13517,7 +13922,7 @@
                   <pic:spPr bwMode="auto">
                     <a:xfrm>
                       <a:off x="0" y="0"/>
-                      <a:ext cx="4533900" cy="3589337"/>
+                      <a:ext cx="1866900" cy="4042460"/>
                     </a:xfrm>
                     <a:prstGeom prst="rect">
                       <a:avLst/>
@@ -13541,7 +13946,7 @@
         <w:pStyle w:val="ImageCaption"/>
       </w:pPr>
       <w:r>
-        <w:t xml:space="preserve">Region Splitting and Merging laboratory built on the shared laboratory bench.</w:t>
+        <w:t xml:space="preserve">Phone layout of the application.</w:t>
       </w:r>
     </w:p>
     <w:p>
@@ -13551,20 +13956,20 @@
       <w:r>
         <w:drawing>
           <wp:inline>
-            <wp:extent cx="3733800" cy="2101853"/>
+            <wp:extent cx="3253740" cy="2575877"/>
             <wp:effectExtent b="0" l="0" r="0" t="0"/>
-            <wp:docPr descr="Before: original word sense disambiguation slide." title="" id="129" name="Picture"/>
+            <wp:docPr descr="Region Splitting and Merging laboratory built on the shared laboratory bench." title="" id="130" name="Picture"/>
             <a:graphic>
               <a:graphicData uri="http://schemas.openxmlformats.org/drawingml/2006/picture">
                 <pic:pic>
                   <pic:nvPicPr>
-                    <pic:cNvPr descr="img/pair3_before.png" id="130" name="Picture"/>
+                    <pic:cNvPr descr="img/lab_split.png" id="131" name="Picture"/>
                     <pic:cNvPicPr>
                       <a:picLocks noChangeArrowheads="1" noChangeAspect="1"/>
                     </pic:cNvPicPr>
                   </pic:nvPicPr>
                   <pic:blipFill>
-                    <a:blip r:embed="rId128"/>
+                    <a:blip r:embed="rId129"/>
                     <a:stretch>
                       <a:fillRect/>
                     </a:stretch>
@@ -13572,7 +13977,7 @@
                   <pic:spPr bwMode="auto">
                     <a:xfrm>
                       <a:off x="0" y="0"/>
-                      <a:ext cx="3733800" cy="2101853"/>
+                      <a:ext cx="3253740" cy="2575877"/>
                     </a:xfrm>
                     <a:prstGeom prst="rect">
                       <a:avLst/>
@@ -13596,7 +14001,7 @@
         <w:pStyle w:val="ImageCaption"/>
       </w:pPr>
       <w:r>
-        <w:t xml:space="preserve">Before: original word sense disambiguation slide.</w:t>
+        <w:t xml:space="preserve">Region Splitting and Merging laboratory built on the shared laboratory bench.</w:t>
       </w:r>
     </w:p>
     <w:p>
@@ -13606,20 +14011,20 @@
       <w:r>
         <w:drawing>
           <wp:inline>
-            <wp:extent cx="4267200" cy="2400300"/>
+            <wp:extent cx="2667000" cy="1501324"/>
             <wp:effectExtent b="0" l="0" r="0" t="0"/>
-            <wp:docPr descr="After: the same slide rebuilt with structured cards, an AI-drawn diagram, a quiz and a laboratory link." title="" id="132" name="Picture"/>
+            <wp:docPr descr="Before: original word sense disambiguation slide." title="" id="133" name="Picture"/>
             <a:graphic>
               <a:graphicData uri="http://schemas.openxmlformats.org/drawingml/2006/picture">
                 <pic:pic>
                   <pic:nvPicPr>
-                    <pic:cNvPr descr="img/pair3_after.png" id="133" name="Picture"/>
+                    <pic:cNvPr descr="img/pair3_before.png" id="134" name="Picture"/>
                     <pic:cNvPicPr>
                       <a:picLocks noChangeArrowheads="1" noChangeAspect="1"/>
                     </pic:cNvPicPr>
                   </pic:nvPicPr>
                   <pic:blipFill>
-                    <a:blip r:embed="rId131"/>
+                    <a:blip r:embed="rId132"/>
                     <a:stretch>
                       <a:fillRect/>
                     </a:stretch>
@@ -13627,7 +14032,7 @@
                   <pic:spPr bwMode="auto">
                     <a:xfrm>
                       <a:off x="0" y="0"/>
-                      <a:ext cx="4267200" cy="2400300"/>
+                      <a:ext cx="2667000" cy="1501324"/>
                     </a:xfrm>
                     <a:prstGeom prst="rect">
                       <a:avLst/>
@@ -13651,11 +14056,66 @@
         <w:pStyle w:val="ImageCaption"/>
       </w:pPr>
       <w:r>
+        <w:t xml:space="preserve">Before: original word sense disambiguation slide.</w:t>
+      </w:r>
+    </w:p>
+    <w:p>
+      <w:pPr>
+        <w:pStyle w:val="CaptionedFigure"/>
+      </w:pPr>
+      <w:r>
+        <w:drawing>
+          <wp:inline>
+            <wp:extent cx="3093720" cy="1740217"/>
+            <wp:effectExtent b="0" l="0" r="0" t="0"/>
+            <wp:docPr descr="After: the same slide rebuilt with structured cards, an AI-drawn diagram, a quiz and a laboratory link." title="" id="136" name="Picture"/>
+            <a:graphic>
+              <a:graphicData uri="http://schemas.openxmlformats.org/drawingml/2006/picture">
+                <pic:pic>
+                  <pic:nvPicPr>
+                    <pic:cNvPr descr="img/pair3_after.png" id="137" name="Picture"/>
+                    <pic:cNvPicPr>
+                      <a:picLocks noChangeArrowheads="1" noChangeAspect="1"/>
+                    </pic:cNvPicPr>
+                  </pic:nvPicPr>
+                  <pic:blipFill>
+                    <a:blip r:embed="rId135"/>
+                    <a:stretch>
+                      <a:fillRect/>
+                    </a:stretch>
+                  </pic:blipFill>
+                  <pic:spPr bwMode="auto">
+                    <a:xfrm>
+                      <a:off x="0" y="0"/>
+                      <a:ext cx="3093720" cy="1740217"/>
+                    </a:xfrm>
+                    <a:prstGeom prst="rect">
+                      <a:avLst/>
+                    </a:prstGeom>
+                    <a:noFill/>
+                    <a:ln w="9525">
+                      <a:noFill/>
+                      <a:headEnd/>
+                      <a:tailEnd/>
+                    </a:ln>
+                  </pic:spPr>
+                </pic:pic>
+              </a:graphicData>
+            </a:graphic>
+          </wp:inline>
+        </w:drawing>
+      </w:r>
+    </w:p>
+    <w:p>
+      <w:pPr>
+        <w:pStyle w:val="ImageCaption"/>
+      </w:pPr>
+      <w:r>
         <w:t xml:space="preserve">After: the same slide rebuilt with structured cards, an AI-drawn diagram, a quiz and a laboratory link.</w:t>
       </w:r>
     </w:p>
-    <w:bookmarkEnd w:id="134"/>
-    <w:bookmarkStart w:id="135" w:name="appendix-b-project-timeline"/>
+    <w:bookmarkEnd w:id="138"/>
+    <w:bookmarkStart w:id="139" w:name="appendix-b-project-timeline"/>
     <w:p>
       <w:pPr>
         <w:pStyle w:val="Heading1"/>
@@ -13899,7 +14359,7 @@
         </w:tc>
       </w:tr>
     </w:tbl>
-    <w:bookmarkEnd w:id="135"/>
+    <w:bookmarkEnd w:id="139"/>
     <w:sectPr>
       <w:headerReference w:type="default" r:id="rId9"/>
       <w:footerReference w:type="default" r:id="rId10"/>

</xml_diff>

<commit_message>
Stray LaTeX from model output turned into readable text on every visual; repeated sentences (expanded paragraph restating a list) dropped before the visual is chosen; report at ~35 body pages (41 with front matter) with equation, algorithm and quiz changes; speaker script mentions them
</commit_message>
<xml_diff>
--- a/docs/report/Learnova_Project_Report.docx
+++ b/docs/report/Learnova_Project_Report.docx
@@ -78,58 +78,6 @@
           <w:r>
             <w:fldChar w:fldCharType="begin" w:dirty="true"/>
             <w:instrText xml:space="preserve">TOC \o "1-3" \h \z \u</w:instrText>
-            <w:fldChar w:fldCharType="separate"/>
-            <w:fldChar w:fldCharType="end"/>
-          </w:r>
-        </w:p>
-      </w:sdtContent>
-    </w:sdt>
-    <w:sdt>
-      <w:sdtPr>
-        <w:docPartObj>
-          <w:docPartGallery w:val="List of Figures"/>
-          <w:docPartUnique/>
-        </w:docPartObj>
-      </w:sdtPr>
-      <w:sdtContent>
-        <w:p>
-          <w:pPr>
-            <w:pStyle w:val="TOCHeading"/>
-          </w:pPr>
-          <w:r>
-            <w:t xml:space="preserve">List of Figures</w:t>
-          </w:r>
-        </w:p>
-        <w:p>
-          <w:r>
-            <w:fldChar w:fldCharType="begin" w:dirty="true"/>
-            <w:instrText xml:space="preserve">TOC \h \z \t "Image Caption" \c</w:instrText>
-            <w:fldChar w:fldCharType="separate"/>
-            <w:fldChar w:fldCharType="end"/>
-          </w:r>
-        </w:p>
-      </w:sdtContent>
-    </w:sdt>
-    <w:sdt>
-      <w:sdtPr>
-        <w:docPartObj>
-          <w:docPartGallery w:val="List of Tables"/>
-          <w:docPartUnique/>
-        </w:docPartObj>
-      </w:sdtPr>
-      <w:sdtContent>
-        <w:p>
-          <w:pPr>
-            <w:pStyle w:val="TOCHeading"/>
-          </w:pPr>
-          <w:r>
-            <w:t xml:space="preserve">List of Tables</w:t>
-          </w:r>
-        </w:p>
-        <w:p>
-          <w:r>
-            <w:fldChar w:fldCharType="begin" w:dirty="true"/>
-            <w:instrText xml:space="preserve">TOC \h \z \t "Table Caption" \c</w:instrText>
             <w:fldChar w:fldCharType="separate"/>
             <w:fldChar w:fldCharType="end"/>
           </w:r>
@@ -10343,6 +10291,159 @@
           </w:p>
         </w:tc>
       </w:tr>
+      <w:tr>
+        <w:tc>
+          <w:tcPr/>
+          <w:p>
+            <w:pPr>
+              <w:pStyle w:val="Compact"/>
+            </w:pPr>
+            <w:r>
+              <w:t xml:space="preserve">Equations appeared as plain text (</w:t>
+            </w:r>
+            <w:r>
+              <w:t xml:space="preserve">“x^2”</w:t>
+            </w:r>
+            <w:r>
+              <w:t xml:space="preserve">,</w:t>
+            </w:r>
+            <w:r>
+              <w:t xml:space="preserve"> </w:t>
+            </w:r>
+            <w:r>
+              <w:t xml:space="preserve">“(1/2m)”</w:t>
+            </w:r>
+            <w:r>
+              <w:t xml:space="preserve">)</w:t>
+            </w:r>
+          </w:p>
+        </w:tc>
+        <w:tc>
+          <w:tcPr/>
+          <w:p>
+            <w:pPr>
+              <w:pStyle w:val="Compact"/>
+            </w:pPr>
+            <w:r>
+              <w:t xml:space="preserve">the slide text was copied as typed</w:t>
+            </w:r>
+          </w:p>
+        </w:tc>
+        <w:tc>
+          <w:tcPr/>
+          <w:p>
+            <w:pPr>
+              <w:pStyle w:val="Compact"/>
+            </w:pPr>
+            <w:r>
+              <w:t xml:space="preserve">equations parsed into fractions, powers, sums and roots and written as native Office Math (PPTX) and MathML (web)</w:t>
+            </w:r>
+          </w:p>
+        </w:tc>
+        <w:tc>
+          <w:tcPr/>
+          <w:p>
+            <w:pPr>
+              <w:pStyle w:val="Compact"/>
+            </w:pPr>
+            <w:r>
+              <w:t xml:space="preserve">equations look as they do in Word</w:t>
+            </w:r>
+          </w:p>
+        </w:tc>
+      </w:tr>
+      <w:tr>
+        <w:tc>
+          <w:tcPr/>
+          <w:p>
+            <w:pPr>
+              <w:pStyle w:val="Compact"/>
+            </w:pPr>
+            <w:r>
+              <w:t xml:space="preserve">Pseudocode lost its indentation</w:t>
+            </w:r>
+          </w:p>
+        </w:tc>
+        <w:tc>
+          <w:tcPr/>
+          <w:p>
+            <w:pPr>
+              <w:pStyle w:val="Compact"/>
+            </w:pPr>
+            <w:r>
+              <w:t xml:space="preserve">export flattens bullet levels</w:t>
+            </w:r>
+          </w:p>
+        </w:tc>
+        <w:tc>
+          <w:tcPr/>
+          <w:p>
+            <w:pPr>
+              <w:pStyle w:val="Compact"/>
+            </w:pPr>
+            <w:r>
+              <w:t xml:space="preserve">a depth counter re-indents after for/while/if/repeat and dedents at end/until/else</w:t>
+            </w:r>
+          </w:p>
+        </w:tc>
+        <w:tc>
+          <w:tcPr/>
+          <w:p>
+            <w:pPr>
+              <w:pStyle w:val="Compact"/>
+            </w:pPr>
+            <w:r>
+              <w:t xml:space="preserve">loops and branches read correctly</w:t>
+            </w:r>
+          </w:p>
+        </w:tc>
+      </w:tr>
+      <w:tr>
+        <w:tc>
+          <w:tcPr/>
+          <w:p>
+            <w:pPr>
+              <w:pStyle w:val="Compact"/>
+            </w:pPr>
+            <w:r>
+              <w:t xml:space="preserve">Long decks had a quiz only every nine slides</w:t>
+            </w:r>
+          </w:p>
+        </w:tc>
+        <w:tc>
+          <w:tcPr/>
+          <w:p>
+            <w:pPr>
+              <w:pStyle w:val="Compact"/>
+            </w:pPr>
+            <w:r>
+              <w:t xml:space="preserve">spacing grew with deck length</w:t>
+            </w:r>
+          </w:p>
+        </w:tc>
+        <w:tc>
+          <w:tcPr/>
+          <w:p>
+            <w:pPr>
+              <w:pStyle w:val="Compact"/>
+            </w:pPr>
+            <w:r>
+              <w:t xml:space="preserve">a checkpoint every four content slides, at most twenty per deck</w:t>
+            </w:r>
+          </w:p>
+        </w:tc>
+        <w:tc>
+          <w:tcPr/>
+          <w:p>
+            <w:pPr>
+              <w:pStyle w:val="Compact"/>
+            </w:pPr>
+            <w:r>
+              <w:t xml:space="preserve">students answer something every few minutes</w:t>
+            </w:r>
+          </w:p>
+        </w:tc>
+      </w:tr>
     </w:tbl>
     <w:p>
       <w:pPr>
@@ -13830,7 +13931,7 @@
       </w:r>
     </w:p>
     <w:bookmarkEnd w:id="122"/>
-    <w:bookmarkStart w:id="138" w:name="appendix-a-sample-outputs"/>
+    <w:bookmarkStart w:id="132" w:name="appendix-a-sample-outputs"/>
     <w:p>
       <w:pPr>
         <w:pStyle w:val="Heading1"/>
@@ -13901,75 +14002,20 @@
       <w:r>
         <w:drawing>
           <wp:inline>
-            <wp:extent cx="1866900" cy="4042460"/>
+            <wp:extent cx="3253740" cy="2575877"/>
             <wp:effectExtent b="0" l="0" r="0" t="0"/>
-            <wp:docPr descr="Phone layout of the application." title="" id="127" name="Picture"/>
+            <wp:docPr descr="Region Splitting and Merging laboratory built on the shared laboratory bench." title="" id="127" name="Picture"/>
             <a:graphic>
               <a:graphicData uri="http://schemas.openxmlformats.org/drawingml/2006/picture">
                 <pic:pic>
                   <pic:nvPicPr>
-                    <pic:cNvPr descr="img/mobile-home.jpg" id="128" name="Picture"/>
+                    <pic:cNvPr descr="img/lab_split.png" id="128" name="Picture"/>
                     <pic:cNvPicPr>
                       <a:picLocks noChangeArrowheads="1" noChangeAspect="1"/>
                     </pic:cNvPicPr>
                   </pic:nvPicPr>
                   <pic:blipFill>
                     <a:blip r:embed="rId126"/>
-                    <a:stretch>
-                      <a:fillRect/>
-                    </a:stretch>
-                  </pic:blipFill>
-                  <pic:spPr bwMode="auto">
-                    <a:xfrm>
-                      <a:off x="0" y="0"/>
-                      <a:ext cx="1866900" cy="4042460"/>
-                    </a:xfrm>
-                    <a:prstGeom prst="rect">
-                      <a:avLst/>
-                    </a:prstGeom>
-                    <a:noFill/>
-                    <a:ln w="9525">
-                      <a:noFill/>
-                      <a:headEnd/>
-                      <a:tailEnd/>
-                    </a:ln>
-                  </pic:spPr>
-                </pic:pic>
-              </a:graphicData>
-            </a:graphic>
-          </wp:inline>
-        </w:drawing>
-      </w:r>
-    </w:p>
-    <w:p>
-      <w:pPr>
-        <w:pStyle w:val="ImageCaption"/>
-      </w:pPr>
-      <w:r>
-        <w:t xml:space="preserve">Phone layout of the application.</w:t>
-      </w:r>
-    </w:p>
-    <w:p>
-      <w:pPr>
-        <w:pStyle w:val="CaptionedFigure"/>
-      </w:pPr>
-      <w:r>
-        <w:drawing>
-          <wp:inline>
-            <wp:extent cx="3253740" cy="2575877"/>
-            <wp:effectExtent b="0" l="0" r="0" t="0"/>
-            <wp:docPr descr="Region Splitting and Merging laboratory built on the shared laboratory bench." title="" id="130" name="Picture"/>
-            <a:graphic>
-              <a:graphicData uri="http://schemas.openxmlformats.org/drawingml/2006/picture">
-                <pic:pic>
-                  <pic:nvPicPr>
-                    <pic:cNvPr descr="img/lab_split.png" id="131" name="Picture"/>
-                    <pic:cNvPicPr>
-                      <a:picLocks noChangeArrowheads="1" noChangeAspect="1"/>
-                    </pic:cNvPicPr>
-                  </pic:nvPicPr>
-                  <pic:blipFill>
-                    <a:blip r:embed="rId129"/>
                     <a:stretch>
                       <a:fillRect/>
                     </a:stretch>
@@ -14011,75 +14057,20 @@
       <w:r>
         <w:drawing>
           <wp:inline>
-            <wp:extent cx="2667000" cy="1501324"/>
+            <wp:extent cx="3093720" cy="1740217"/>
             <wp:effectExtent b="0" l="0" r="0" t="0"/>
-            <wp:docPr descr="Before: original word sense disambiguation slide." title="" id="133" name="Picture"/>
+            <wp:docPr descr="After: the same slide rebuilt with structured cards, an AI-drawn diagram, a quiz and a laboratory link." title="" id="130" name="Picture"/>
             <a:graphic>
               <a:graphicData uri="http://schemas.openxmlformats.org/drawingml/2006/picture">
                 <pic:pic>
                   <pic:nvPicPr>
-                    <pic:cNvPr descr="img/pair3_before.png" id="134" name="Picture"/>
+                    <pic:cNvPr descr="img/pair3_after.png" id="131" name="Picture"/>
                     <pic:cNvPicPr>
                       <a:picLocks noChangeArrowheads="1" noChangeAspect="1"/>
                     </pic:cNvPicPr>
                   </pic:nvPicPr>
                   <pic:blipFill>
-                    <a:blip r:embed="rId132"/>
-                    <a:stretch>
-                      <a:fillRect/>
-                    </a:stretch>
-                  </pic:blipFill>
-                  <pic:spPr bwMode="auto">
-                    <a:xfrm>
-                      <a:off x="0" y="0"/>
-                      <a:ext cx="2667000" cy="1501324"/>
-                    </a:xfrm>
-                    <a:prstGeom prst="rect">
-                      <a:avLst/>
-                    </a:prstGeom>
-                    <a:noFill/>
-                    <a:ln w="9525">
-                      <a:noFill/>
-                      <a:headEnd/>
-                      <a:tailEnd/>
-                    </a:ln>
-                  </pic:spPr>
-                </pic:pic>
-              </a:graphicData>
-            </a:graphic>
-          </wp:inline>
-        </w:drawing>
-      </w:r>
-    </w:p>
-    <w:p>
-      <w:pPr>
-        <w:pStyle w:val="ImageCaption"/>
-      </w:pPr>
-      <w:r>
-        <w:t xml:space="preserve">Before: original word sense disambiguation slide.</w:t>
-      </w:r>
-    </w:p>
-    <w:p>
-      <w:pPr>
-        <w:pStyle w:val="CaptionedFigure"/>
-      </w:pPr>
-      <w:r>
-        <w:drawing>
-          <wp:inline>
-            <wp:extent cx="3093720" cy="1740217"/>
-            <wp:effectExtent b="0" l="0" r="0" t="0"/>
-            <wp:docPr descr="After: the same slide rebuilt with structured cards, an AI-drawn diagram, a quiz and a laboratory link." title="" id="136" name="Picture"/>
-            <a:graphic>
-              <a:graphicData uri="http://schemas.openxmlformats.org/drawingml/2006/picture">
-                <pic:pic>
-                  <pic:nvPicPr>
-                    <pic:cNvPr descr="img/pair3_after.png" id="137" name="Picture"/>
-                    <pic:cNvPicPr>
-                      <a:picLocks noChangeArrowheads="1" noChangeAspect="1"/>
-                    </pic:cNvPicPr>
-                  </pic:nvPicPr>
-                  <pic:blipFill>
-                    <a:blip r:embed="rId135"/>
+                    <a:blip r:embed="rId129"/>
                     <a:stretch>
                       <a:fillRect/>
                     </a:stretch>
@@ -14114,8 +14105,8 @@
         <w:t xml:space="preserve">After: the same slide rebuilt with structured cards, an AI-drawn diagram, a quiz and a laboratory link.</w:t>
       </w:r>
     </w:p>
-    <w:bookmarkEnd w:id="138"/>
-    <w:bookmarkStart w:id="139" w:name="appendix-b-project-timeline"/>
+    <w:bookmarkEnd w:id="132"/>
+    <w:bookmarkStart w:id="133" w:name="appendix-b-project-timeline"/>
     <w:p>
       <w:pPr>
         <w:pStyle w:val="Heading1"/>
@@ -14359,7 +14350,7 @@
         </w:tc>
       </w:tr>
     </w:tbl>
-    <w:bookmarkEnd w:id="139"/>
+    <w:bookmarkEnd w:id="133"/>
     <w:sectPr>
       <w:headerReference w:type="default" r:id="rId9"/>
       <w:footerReference w:type="default" r:id="rId10"/>
@@ -14815,7 +14806,7 @@
     <w:name w:val="Normal"/>
     <w:qFormat/>
     <w:pPr>
-      <w:spacing w:after="120" w:line="360" w:lineRule="auto"/>
+      <w:spacing w:after="80" w:line="264" w:lineRule="auto"/>
       <w:jc w:val="both"/>
     </w:pPr>
     <w:rPr>
@@ -14829,7 +14820,7 @@
     <w:link w:val="BodyTextChar"/>
     <w:qFormat/>
     <w:pPr>
-      <w:spacing w:after="120" w:before="180" w:line="360" w:lineRule="auto"/>
+      <w:spacing w:after="80" w:before="180" w:line="264" w:lineRule="auto"/>
       <w:jc w:val="both"/>
     </w:pPr>
     <w:rPr>
@@ -14843,7 +14834,7 @@
     <w:next w:val="BodyText"/>
     <w:qFormat/>
     <w:pPr>
-      <w:spacing w:after="120" w:line="360" w:lineRule="auto"/>
+      <w:spacing w:after="80" w:line="264" w:lineRule="auto"/>
       <w:jc w:val="both"/>
     </w:pPr>
     <w:rPr>
@@ -14856,7 +14847,7 @@
     <w:basedOn w:val="BodyText"/>
     <w:qFormat/>
     <w:pPr>
-      <w:spacing w:after="120" w:before="36" w:line="360" w:lineRule="auto"/>
+      <w:spacing w:after="80" w:before="36" w:line="264" w:lineRule="auto"/>
       <w:jc w:val="both"/>
     </w:pPr>
     <w:rPr>
@@ -15022,7 +15013,8 @@
     <w:pPr>
       <w:keepNext/>
       <w:keepLines/>
-      <w:spacing w:after="80" w:before="360"/>
+      <w:pageBreakBefore w:val="0"/>
+      <w:spacing w:after="80" w:before="200"/>
       <w:outlineLvl w:val="0"/>
     </w:pPr>
     <w:rPr>
@@ -15046,7 +15038,8 @@
     <w:pPr>
       <w:keepNext/>
       <w:keepLines/>
-      <w:spacing w:after="80" w:before="160"/>
+      <w:pageBreakBefore w:val="0"/>
+      <w:spacing w:after="80" w:before="200"/>
       <w:outlineLvl w:val="1"/>
     </w:pPr>
     <w:rPr>
@@ -15070,7 +15063,8 @@
     <w:pPr>
       <w:keepNext/>
       <w:keepLines/>
-      <w:spacing w:after="80" w:before="160"/>
+      <w:pageBreakBefore w:val="0"/>
+      <w:spacing w:after="80" w:before="200"/>
       <w:outlineLvl w:val="2"/>
     </w:pPr>
     <w:rPr>

</xml_diff>

<commit_message>
Papers and report: measured escalation on eight real inputs (share kept offline per place), behaviour when free quotas run out
</commit_message>
<xml_diff>
--- a/docs/report/Learnova_Project_Report.docx
+++ b/docs/report/Learnova_Project_Report.docx
@@ -10444,7 +10444,282 @@
           </w:p>
         </w:tc>
       </w:tr>
+      <w:tr>
+        <w:tc>
+          <w:tcPr/>
+          <w:p>
+            <w:pPr>
+              <w:pStyle w:val="Compact"/>
+            </w:pPr>
+            <w:r>
+              <w:t xml:space="preserve">Word (.docx) notes failed to convert</w:t>
+            </w:r>
+          </w:p>
+        </w:tc>
+        <w:tc>
+          <w:tcPr/>
+          <w:p>
+            <w:pPr>
+              <w:pStyle w:val="Compact"/>
+            </w:pPr>
+            <w:r>
+              <w:t xml:space="preserve">the Word converter package was missing and the fallback assumed a PDF</w:t>
+            </w:r>
+          </w:p>
+        </w:tc>
+        <w:tc>
+          <w:tcPr/>
+          <w:p>
+            <w:pPr>
+              <w:pStyle w:val="Compact"/>
+            </w:pPr>
+            <w:r>
+              <w:t xml:space="preserve">a native Word reader keeps headings as sections, list levels and tables</w:t>
+            </w:r>
+          </w:p>
+        </w:tc>
+        <w:tc>
+          <w:tcPr/>
+          <w:p>
+            <w:pPr>
+              <w:pStyle w:val="Compact"/>
+            </w:pPr>
+            <w:r>
+              <w:t xml:space="preserve">Word notes always convert</w:t>
+            </w:r>
+          </w:p>
+        </w:tc>
+      </w:tr>
+      <w:tr>
+        <w:tc>
+          <w:tcPr/>
+          <w:p>
+            <w:pPr>
+              <w:pStyle w:val="Compact"/>
+            </w:pPr>
+            <w:r>
+              <w:t xml:space="preserve">“Advantages / Trade-offs”</w:t>
+            </w:r>
+            <w:r>
+              <w:t xml:space="preserve"> </w:t>
+            </w:r>
+            <w:r>
+              <w:t xml:space="preserve">boxes on slides that weigh nothing up</w:t>
+            </w:r>
+          </w:p>
+        </w:tc>
+        <w:tc>
+          <w:tcPr/>
+          <w:p>
+            <w:pPr>
+              <w:pStyle w:val="Compact"/>
+            </w:pPr>
+            <w:r>
+              <w:t xml:space="preserve">the AI’s visual choice was accepted as given</w:t>
+            </w:r>
+          </w:p>
+        </w:tc>
+        <w:tc>
+          <w:tcPr/>
+          <w:p>
+            <w:pPr>
+              <w:pStyle w:val="Compact"/>
+            </w:pPr>
+            <w:r>
+              <w:t xml:space="preserve">a pros-and-cons layout needs the words that justify it, else plain cards</w:t>
+            </w:r>
+          </w:p>
+        </w:tc>
+        <w:tc>
+          <w:tcPr/>
+          <w:p>
+            <w:pPr>
+              <w:pStyle w:val="Compact"/>
+            </w:pPr>
+            <w:r>
+              <w:t xml:space="preserve">no misleading labels</w:t>
+            </w:r>
+          </w:p>
+        </w:tc>
+      </w:tr>
+      <w:tr>
+        <w:tc>
+          <w:tcPr/>
+          <w:p>
+            <w:pPr>
+              <w:pStyle w:val="Compact"/>
+            </w:pPr>
+            <w:r>
+              <w:t xml:space="preserve">XML examples drawn as</w:t>
+            </w:r>
+            <w:r>
+              <w:t xml:space="preserve"> </w:t>
+            </w:r>
+            <w:r>
+              <w:t xml:space="preserve">“equations”</w:t>
+            </w:r>
+          </w:p>
+        </w:tc>
+        <w:tc>
+          <w:tcPr/>
+          <w:p>
+            <w:pPr>
+              <w:pStyle w:val="Compact"/>
+            </w:pPr>
+            <w:r>
+              <w:t xml:space="preserve">lines containing</w:t>
+            </w:r>
+            <w:r>
+              <w:t xml:space="preserve"> </w:t>
+            </w:r>
+            <w:r>
+              <w:t xml:space="preserve">“=”</w:t>
+            </w:r>
+          </w:p>
+        </w:tc>
+        <w:tc>
+          <w:tcPr/>
+          <w:p>
+            <w:pPr>
+              <w:pStyle w:val="Compact"/>
+            </w:pPr>
+            <w:r>
+              <w:t xml:space="preserve">markup lines are shown verbatim in a code panel</w:t>
+            </w:r>
+          </w:p>
+        </w:tc>
+        <w:tc>
+          <w:tcPr/>
+          <w:p>
+            <w:pPr>
+              <w:pStyle w:val="Compact"/>
+            </w:pPr>
+            <w:r>
+              <w:t xml:space="preserve">examples read as written</w:t>
+            </w:r>
+          </w:p>
+        </w:tc>
+      </w:tr>
     </w:tbl>
+    <w:p>
+      <w:pPr>
+        <w:pStyle w:val="BodyText"/>
+      </w:pPr>
+      <w:r>
+        <w:rPr>
+          <w:b/>
+          <w:bCs/>
+        </w:rPr>
+        <w:t xml:space="preserve">Offline first, free keys only when needed.</w:t>
+      </w:r>
+      <w:r>
+        <w:t xml:space="preserve"> </w:t>
+      </w:r>
+      <w:r>
+        <w:t xml:space="preserve">The college uses only free-tier API keys, so the system now computes the</w:t>
+      </w:r>
+      <w:r>
+        <w:t xml:space="preserve"> </w:t>
+      </w:r>
+      <w:r>
+        <w:t xml:space="preserve">rule-based result in every case and calls a model only when a cheap check finds that result weak: Tesseract’s text that does</w:t>
+      </w:r>
+      <w:r>
+        <w:t xml:space="preserve"> </w:t>
+      </w:r>
+      <w:r>
+        <w:t xml:space="preserve">not read as language, a title that is only a topic label or a slide under sixty words, a slide whose idea needs a real drawing</w:t>
+      </w:r>
+      <w:r>
+        <w:t xml:space="preserve"> </w:t>
+      </w:r>
+      <w:r>
+        <w:t xml:space="preserve">(a process, a graph, labelled parts or a comparison), or too little structure for an offline laboratory. Visual choice and</w:t>
+      </w:r>
+      <w:r>
+        <w:t xml:space="preserve"> </w:t>
+      </w:r>
+      <w:r>
+        <w:t xml:space="preserve">explanations already followed this rule. A switch (</w:t>
+      </w:r>
+      <w:r>
+        <w:rPr>
+          <w:rStyle w:val="VerbatimChar"/>
+        </w:rPr>
+        <w:t xml:space="preserve">auto</w:t>
+      </w:r>
+      <w:r>
+        <w:t xml:space="preserve">,</w:t>
+      </w:r>
+      <w:r>
+        <w:t xml:space="preserve"> </w:t>
+      </w:r>
+      <w:r>
+        <w:rPr>
+          <w:rStyle w:val="VerbatimChar"/>
+        </w:rPr>
+        <w:t xml:space="preserve">always</w:t>
+      </w:r>
+      <w:r>
+        <w:t xml:space="preserve">,</w:t>
+      </w:r>
+      <w:r>
+        <w:t xml:space="preserve"> </w:t>
+      </w:r>
+      <w:r>
+        <w:rPr>
+          <w:rStyle w:val="VerbatimChar"/>
+        </w:rPr>
+        <w:t xml:space="preserve">off</w:t>
+      </w:r>
+      <w:r>
+        <w:t xml:space="preserve">) sets the policy, and every deck records how many</w:t>
+      </w:r>
+      <w:r>
+        <w:t xml:space="preserve"> </w:t>
+      </w:r>
+      <w:r>
+        <w:t xml:space="preserve">decisions went to a model and how many stayed offline. Several free keys are pooled for each provider; a key that reaches its</w:t>
+      </w:r>
+      <w:r>
+        <w:t xml:space="preserve"> </w:t>
+      </w:r>
+      <w:r>
+        <w:t xml:space="preserve">daily limit is set aside for fifteen minutes and the next one is used.</w:t>
+      </w:r>
+    </w:p>
+    <w:p>
+      <w:pPr>
+        <w:pStyle w:val="BodyText"/>
+      </w:pPr>
+      <w:r>
+        <w:t xml:space="preserve">On the eight test inputs (599 output slides) this kept 37% of picture reads, 30% of diagram requests and 22% of takeaway</w:t>
+      </w:r>
+      <w:r>
+        <w:t xml:space="preserve"> </w:t>
+      </w:r>
+      <w:r>
+        <w:t xml:space="preserve">requests offline. Titles were sent to the model in 97% of cases, because lecture decks almost always use topic labels such as</w:t>
+      </w:r>
+      <w:r>
+        <w:t xml:space="preserve"> </w:t>
+      </w:r>
+      <w:r>
+        <w:t xml:space="preserve">“Linear Regression”</w:t>
+      </w:r>
+      <w:r>
+        <w:t xml:space="preserve"> </w:t>
+      </w:r>
+      <w:r>
+        <w:t xml:space="preserve">rather than statements. During the run every free Gemini key and the Groq account reached their daily</w:t>
+      </w:r>
+      <w:r>
+        <w:t xml:space="preserve"> </w:t>
+      </w:r>
+      <w:r>
+        <w:t xml:space="preserve">limit, and the remaining decks were completed by the offline logic without a single failed build.</w:t>
+      </w:r>
+    </w:p>
     <w:p>
       <w:pPr>
         <w:pStyle w:val="BodyText"/>

</xml_diff>

<commit_message>
Papers, report, review deck and speaker script: flowcharts, code presentation, Q&A cards and the unseen-input robustness results (9/9 built, 2.3% slides flagged); report build finds pandoc and LaTeX
</commit_message>
<xml_diff>
--- a/docs/report/Learnova_Project_Report.docx
+++ b/docs/report/Learnova_Project_Report.docx
@@ -2545,7 +2545,7 @@
         <w:t xml:space="preserve"> </w:t>
       </w:r>
       <w:r>
-        <w:t xml:space="preserve">Every component of the system relies on mature open-source libraries, and the complete pipeline runs on an ordinary laptop. The prototype is working end to end, with 757 automated tests.</w:t>
+        <w:t xml:space="preserve">Every component of the system relies on mature open-source libraries, and the complete pipeline runs on an ordinary laptop. The prototype is working end to end, with 774 automated tests.</w:t>
       </w:r>
     </w:p>
     <w:p>
@@ -9268,7 +9268,7 @@
               <w:pStyle w:val="Compact"/>
             </w:pPr>
             <w:r>
-              <w:t xml:space="preserve">757 automated tests</w:t>
+              <w:t xml:space="preserve">774 automated tests</w:t>
             </w:r>
           </w:p>
         </w:tc>
@@ -9878,7 +9878,7 @@
         <w:pStyle w:val="FirstParagraph"/>
       </w:pPr>
       <w:r>
-        <w:t xml:space="preserve">The project has 757 automated tests that run in about 25 seconds. They cover each parser, each detector of the decision engine, the layout guarantees (no broken words, no overflow), the quiz rules, every solver, the laboratory policy, the diagram sanitiser, the key pool, the API endpoints and complete end-to-end generation. The tests always run without AI keys: the test configuration blanks every key, so that a key in the developer’s environment cannot change the results. In addition, an end-to-end script drives the running API with real files, a layout-audit tool checks finished PowerPoint files, and the gold sets measure the accuracy of the decision engine.</w:t>
+        <w:t xml:space="preserve">The project has 774 automated tests that run in about 25 seconds. They cover each parser, each detector of the decision engine, the layout guarantees (no broken words, no overflow), the quiz rules, every solver, the laboratory policy, the diagram sanitiser, the key pool, the API endpoints and complete end-to-end generation. The tests always run without AI keys: the test configuration blanks every key, so that a key in the developer’s environment cannot change the results. In addition, an end-to-end script drives the running API with real files, a layout-audit tool checks finished PowerPoint files, and the gold sets measure the accuracy of the decision engine.</w:t>
       </w:r>
     </w:p>
     <w:bookmarkEnd w:id="79"/>
@@ -10600,6 +10600,208 @@
           </w:p>
         </w:tc>
       </w:tr>
+      <w:tr>
+        <w:tc>
+          <w:tcPr/>
+          <w:p>
+            <w:pPr>
+              <w:pStyle w:val="Compact"/>
+            </w:pPr>
+            <w:r>
+              <w:t xml:space="preserve">A procedure with decisions drawn as a row of chevrons</w:t>
+            </w:r>
+          </w:p>
+        </w:tc>
+        <w:tc>
+          <w:tcPr/>
+          <w:p>
+            <w:pPr>
+              <w:pStyle w:val="Compact"/>
+            </w:pPr>
+            <w:r>
+              <w:t xml:space="preserve">the process visual cannot show a branch or a loop</w:t>
+            </w:r>
+          </w:p>
+        </w:tc>
+        <w:tc>
+          <w:tcPr/>
+          <w:p>
+            <w:pPr>
+              <w:pStyle w:val="Compact"/>
+            </w:pPr>
+            <w:r>
+              <w:t xml:space="preserve">a FLOWCHART visual: start/end, process boxes, decision diamonds, Yes/No labels, side boxes and loop-backs</w:t>
+            </w:r>
+          </w:p>
+        </w:tc>
+        <w:tc>
+          <w:tcPr/>
+          <w:p>
+            <w:pPr>
+              <w:pStyle w:val="Compact"/>
+            </w:pPr>
+            <w:r>
+              <w:t xml:space="preserve">decisions and loops are visible</w:t>
+            </w:r>
+          </w:p>
+        </w:tc>
+      </w:tr>
+      <w:tr>
+        <w:tc>
+          <w:tcPr/>
+          <w:p>
+            <w:pPr>
+              <w:pStyle w:val="Compact"/>
+            </w:pPr>
+            <w:r>
+              <w:t xml:space="preserve">Code from notebook PDFs shown as paragraphs</w:t>
+            </w:r>
+          </w:p>
+        </w:tc>
+        <w:tc>
+          <w:tcPr/>
+          <w:p>
+            <w:pPr>
+              <w:pStyle w:val="Compact"/>
+            </w:pPr>
+            <w:r>
+              <w:t xml:space="preserve">OCR flattened the code and split keywords</w:t>
+            </w:r>
+          </w:p>
+        </w:tc>
+        <w:tc>
+          <w:tcPr/>
+          <w:p>
+            <w:pPr>
+              <w:pStyle w:val="Compact"/>
+            </w:pPr>
+            <w:r>
+              <w:t xml:space="preserve">keywords repaired, code cut into statements, an editor panel with line numbers, syntax colours, a note per line and an output console</w:t>
+            </w:r>
+          </w:p>
+        </w:tc>
+        <w:tc>
+          <w:tcPr/>
+          <w:p>
+            <w:pPr>
+              <w:pStyle w:val="Compact"/>
+            </w:pPr>
+            <w:r>
+              <w:t xml:space="preserve">code reads like code</w:t>
+            </w:r>
+          </w:p>
+        </w:tc>
+      </w:tr>
+      <w:tr>
+        <w:tc>
+          <w:tcPr/>
+          <w:p>
+            <w:pPr>
+              <w:pStyle w:val="Compact"/>
+            </w:pPr>
+            <w:r>
+              <w:t xml:space="preserve">Training logs shown as walls of numbers</w:t>
+            </w:r>
+          </w:p>
+        </w:tc>
+        <w:tc>
+          <w:tcPr/>
+          <w:p>
+            <w:pPr>
+              <w:pStyle w:val="Compact"/>
+            </w:pPr>
+            <w:r>
+              <w:t xml:space="preserve">“Epoch / Cost”</w:t>
+            </w:r>
+            <w:r>
+              <w:t xml:space="preserve"> </w:t>
+            </w:r>
+            <w:r>
+              <w:t xml:space="preserve">lines were treated as text</w:t>
+            </w:r>
+          </w:p>
+        </w:tc>
+        <w:tc>
+          <w:tcPr/>
+          <w:p>
+            <w:pPr>
+              <w:pStyle w:val="Compact"/>
+            </w:pPr>
+            <w:r>
+              <w:t xml:space="preserve">the log is drawn as a trend chart</w:t>
+            </w:r>
+          </w:p>
+        </w:tc>
+        <w:tc>
+          <w:tcPr/>
+          <w:p>
+            <w:pPr>
+              <w:pStyle w:val="Compact"/>
+            </w:pPr>
+            <w:r>
+              <w:t xml:space="preserve">the curve is visible at a glance</w:t>
+            </w:r>
+          </w:p>
+        </w:tc>
+      </w:tr>
+      <w:tr>
+        <w:tc>
+          <w:tcPr/>
+          <w:p>
+            <w:pPr>
+              <w:pStyle w:val="Compact"/>
+            </w:pPr>
+            <w:r>
+              <w:t xml:space="preserve">Lab viva questions turned into fake flowcharts</w:t>
+            </w:r>
+          </w:p>
+        </w:tc>
+        <w:tc>
+          <w:tcPr/>
+          <w:p>
+            <w:pPr>
+              <w:pStyle w:val="Compact"/>
+            </w:pPr>
+            <w:r>
+              <w:t xml:space="preserve">questions ending in</w:t>
+            </w:r>
+            <w:r>
+              <w:t xml:space="preserve"> </w:t>
+            </w:r>
+            <w:r>
+              <w:t xml:space="preserve">“?”</w:t>
+            </w:r>
+            <w:r>
+              <w:t xml:space="preserve"> </w:t>
+            </w:r>
+            <w:r>
+              <w:t xml:space="preserve">were read as decisions</w:t>
+            </w:r>
+          </w:p>
+        </w:tc>
+        <w:tc>
+          <w:tcPr/>
+          <w:p>
+            <w:pPr>
+              <w:pStyle w:val="Compact"/>
+            </w:pPr>
+            <w:r>
+              <w:t xml:space="preserve">wh-questions with answers become flip cards; only yes/no tests are decisions</w:t>
+            </w:r>
+          </w:p>
+        </w:tc>
+        <w:tc>
+          <w:tcPr/>
+          <w:p>
+            <w:pPr>
+              <w:pStyle w:val="Compact"/>
+            </w:pPr>
+            <w:r>
+              <w:t xml:space="preserve">questions are practised, not drawn</w:t>
+            </w:r>
+          </w:p>
+        </w:tc>
+      </w:tr>
     </w:tbl>
     <w:p>
       <w:pPr>
@@ -10718,6 +10920,48 @@
       </w:r>
       <w:r>
         <w:t xml:space="preserve">limit, and the remaining decks were completed by the offline logic without a single failed build.</w:t>
+      </w:r>
+    </w:p>
+    <w:p>
+      <w:pPr>
+        <w:pStyle w:val="BodyText"/>
+      </w:pPr>
+      <w:r>
+        <w:rPr>
+          <w:b/>
+          <w:bCs/>
+        </w:rPr>
+        <w:t xml:space="preserve">Unseen inputs.</w:t>
+      </w:r>
+      <w:r>
+        <w:t xml:space="preserve"> </w:t>
+      </w:r>
+      <w:r>
+        <w:t xml:space="preserve">To make sure the rules work on files a teacher might upload, not only on the decks used during</w:t>
+      </w:r>
+      <w:r>
+        <w:t xml:space="preserve"> </w:t>
+      </w:r>
+      <w:r>
+        <w:t xml:space="preserve">development, nine inputs that were never seen before were built without any key: two lecture PowerPoint files, two lab</w:t>
+      </w:r>
+      <w:r>
+        <w:t xml:space="preserve"> </w:t>
+      </w:r>
+      <w:r>
+        <w:t xml:space="preserve">manuals, two research papers, a teaching guide, a Word file and a one-line topic. All nine built (482 slides in 89 seconds in</w:t>
+      </w:r>
+      <w:r>
+        <w:t xml:space="preserve"> </w:t>
+      </w:r>
+      <w:r>
+        <w:t xml:space="preserve">total). The layout audit flagged 20 slides (4.1%) before the changes of this round and 11 (2.3%) after; nine of those are on a</w:t>
+      </w:r>
+      <w:r>
+        <w:t xml:space="preserve"> </w:t>
+      </w:r>
+      <w:r>
+        <w:t xml:space="preserve">single notebook export where code sits beside a picture.</w:t>
       </w:r>
     </w:p>
     <w:p>

</xml_diff>